<commit_message>
Ex 1 a,b,c completed with pdfs
</commit_message>
<xml_diff>
--- a/EX1/screenshots.docx
+++ b/EX1/screenshots.docx
@@ -2,8 +2,1563 @@
 <file path=word/document.xml><?xml version="1.0" encoding="utf-8"?>
 <w:document xmlns:wpc="http://schemas.microsoft.com/office/word/2010/wordprocessingCanvas" xmlns:cx="http://schemas.microsoft.com/office/drawing/2014/chartex" xmlns:cx1="http://schemas.microsoft.com/office/drawing/2015/9/8/chartex" xmlns:cx2="http://schemas.microsoft.com/office/drawing/2015/10/21/chartex" xmlns:cx3="http://schemas.microsoft.com/office/drawing/2016/5/9/chartex" xmlns:cx4="http://schemas.microsoft.com/office/drawing/2016/5/10/chartex" xmlns:cx5="http://schemas.microsoft.com/office/drawing/2016/5/11/chartex" xmlns:cx6="http://schemas.microsoft.com/office/drawing/2016/5/12/chartex" xmlns:cx7="http://schemas.microsoft.com/office/drawing/2016/5/13/chartex" xmlns:cx8="http://schemas.microsoft.com/office/drawing/2016/5/14/chartex" xmlns:mc="http://schemas.openxmlformats.org/markup-compatibility/2006" xmlns:aink="http://schemas.microsoft.com/office/drawing/2016/ink" xmlns:am3d="http://schemas.microsoft.com/office/drawing/2017/model3d" xmlns:o="urn:schemas-microsoft-com:office:office" xmlns:oel="http://schemas.microsoft.com/office/2019/extlst" xmlns:r="http://schemas.openxmlformats.org/officeDocument/2006/relationships" xmlns:m="http://schemas.openxmlformats.org/officeDocument/2006/math" xmlns:v="urn:schemas-microsoft-com:vml" xmlns:wp14="http://schemas.microsoft.com/office/word/2010/wordprocessingDrawing" xmlns:wp="http://schemas.openxmlformats.org/drawingml/2006/wordprocessingDrawing" xmlns:w10="urn:schemas-microsoft-com:office:word" xmlns:w="http://schemas.openxmlformats.org/wordprocessingml/2006/main" xmlns:w14="http://schemas.microsoft.com/office/word/2010/wordml" xmlns:w15="http://schemas.microsoft.com/office/word/2012/wordml" xmlns:w16cex="http://schemas.microsoft.com/office/word/2018/wordml/cex" xmlns:w16cid="http://schemas.microsoft.com/office/word/2016/wordml/cid" xmlns:w16="http://schemas.microsoft.com/office/word/2018/wordml" xmlns:w16du="http://schemas.microsoft.com/office/word/2023/wordml/word16du" xmlns:w16sdtdh="http://schemas.microsoft.com/office/word/2020/wordml/sdtdatahash" xmlns:w16sdtfl="http://schemas.microsoft.com/office/word/2024/wordml/sdtformatlock" xmlns:w16se="http://schemas.microsoft.com/office/word/2015/wordml/symex" xmlns:wpg="http://schemas.microsoft.com/office/word/2010/wordprocessingGroup" xmlns:wpi="http://schemas.microsoft.com/office/word/2010/wordprocessingInk" xmlns:wne="http://schemas.microsoft.com/office/word/2006/wordml" xmlns:wps="http://schemas.microsoft.com/office/word/2010/wordprocessingShape" mc:Ignorable="w14 w15 w16se w16cid w16 w16cex w16sdtdh w16sdtfl w16du wp14">
   <w:body>
-    <w:p>
-      <w:r>
+    <w:tbl>
+      <w:tblPr>
+        <w:tblStyle w:val="TableGrid"/>
+        <w:tblW w:w="0" w:type="auto"/>
+        <w:tblLook w:val="04A0" w:firstRow="1" w:lastRow="0" w:firstColumn="1" w:lastColumn="0" w:noHBand="0" w:noVBand="1"/>
+      </w:tblPr>
+      <w:tblGrid>
+        <w:gridCol w:w="1980"/>
+        <w:gridCol w:w="8476"/>
+      </w:tblGrid>
+      <w:tr>
+        <w:trPr>
+          <w:trHeight w:val="841"/>
+        </w:trPr>
+        <w:tc>
+          <w:tcPr>
+            <w:tcW w:w="1980" w:type="dxa"/>
+          </w:tcPr>
+          <w:p>
+            <w:pPr>
+              <w:rPr>
+                <w:b/>
+                <w:bCs/>
+                <w:sz w:val="24"/>
+                <w:szCs w:val="24"/>
+              </w:rPr>
+            </w:pPr>
+            <w:r>
+              <w:rPr>
+                <w:b/>
+                <w:bCs/>
+                <w:sz w:val="24"/>
+                <w:szCs w:val="24"/>
+              </w:rPr>
+              <w:t xml:space="preserve">EX </w:t>
+            </w:r>
+            <w:proofErr w:type="gramStart"/>
+            <w:r>
+              <w:rPr>
+                <w:b/>
+                <w:bCs/>
+                <w:sz w:val="24"/>
+                <w:szCs w:val="24"/>
+              </w:rPr>
+              <w:t>NO :</w:t>
+            </w:r>
+            <w:proofErr w:type="gramEnd"/>
+            <w:r>
+              <w:rPr>
+                <w:b/>
+                <w:bCs/>
+                <w:sz w:val="24"/>
+                <w:szCs w:val="24"/>
+              </w:rPr>
+              <w:t xml:space="preserve"> 1</w:t>
+            </w:r>
+          </w:p>
+          <w:p>
+            <w:pPr>
+              <w:rPr>
+                <w:b/>
+                <w:bCs/>
+                <w:sz w:val="24"/>
+                <w:szCs w:val="24"/>
+              </w:rPr>
+            </w:pPr>
+          </w:p>
+          <w:p>
+            <w:pPr>
+              <w:rPr>
+                <w:b/>
+                <w:bCs/>
+                <w:sz w:val="24"/>
+                <w:szCs w:val="24"/>
+              </w:rPr>
+            </w:pPr>
+            <w:r>
+              <w:rPr>
+                <w:b/>
+                <w:bCs/>
+                <w:sz w:val="24"/>
+                <w:szCs w:val="24"/>
+              </w:rPr>
+              <w:t xml:space="preserve">DATE </w:t>
+            </w:r>
+            <w:proofErr w:type="gramStart"/>
+            <w:r>
+              <w:rPr>
+                <w:b/>
+                <w:bCs/>
+                <w:sz w:val="24"/>
+                <w:szCs w:val="24"/>
+              </w:rPr>
+              <w:t xml:space="preserve">  :</w:t>
+            </w:r>
+            <w:proofErr w:type="gramEnd"/>
+            <w:r>
+              <w:rPr>
+                <w:b/>
+                <w:bCs/>
+                <w:sz w:val="24"/>
+                <w:szCs w:val="24"/>
+              </w:rPr>
+              <w:t xml:space="preserve"> </w:t>
+            </w:r>
+            <w:r>
+              <w:rPr>
+                <w:b/>
+                <w:bCs/>
+                <w:sz w:val="24"/>
+                <w:szCs w:val="24"/>
+              </w:rPr>
+              <w:t>12-06-26</w:t>
+            </w:r>
+          </w:p>
+        </w:tc>
+        <w:tc>
+          <w:tcPr>
+            <w:tcW w:w="8476" w:type="dxa"/>
+          </w:tcPr>
+          <w:p>
+            <w:pPr>
+              <w:rPr>
+                <w:b/>
+                <w:bCs/>
+                <w:sz w:val="24"/>
+                <w:szCs w:val="24"/>
+              </w:rPr>
+            </w:pPr>
+          </w:p>
+          <w:p>
+            <w:pPr>
+              <w:jc w:val="center"/>
+              <w:rPr>
+                <w:b/>
+                <w:bCs/>
+                <w:sz w:val="24"/>
+                <w:szCs w:val="24"/>
+              </w:rPr>
+            </w:pPr>
+            <w:r>
+              <w:rPr>
+                <w:b/>
+                <w:bCs/>
+                <w:sz w:val="24"/>
+                <w:szCs w:val="24"/>
+              </w:rPr>
+              <w:t>DATA ENGINEERING</w:t>
+            </w:r>
+          </w:p>
+        </w:tc>
+      </w:tr>
+    </w:tbl>
+    <w:p>
+      <w:pPr>
+        <w:rPr>
+          <w:b/>
+          <w:bCs/>
+          <w:sz w:val="24"/>
+          <w:szCs w:val="24"/>
+        </w:rPr>
+      </w:pPr>
+    </w:p>
+    <w:p>
+      <w:pPr>
+        <w:rPr>
+          <w:b/>
+          <w:bCs/>
+          <w:sz w:val="24"/>
+          <w:szCs w:val="24"/>
+        </w:rPr>
+      </w:pPr>
+      <w:r>
+        <w:rPr>
+          <w:b/>
+          <w:bCs/>
+          <w:sz w:val="24"/>
+          <w:szCs w:val="24"/>
+        </w:rPr>
+        <w:t>AIM:</w:t>
+      </w:r>
+    </w:p>
+    <w:p>
+      <w:r>
+        <w:t>Understanding and Exploring Different Types of Data</w:t>
+      </w:r>
+    </w:p>
+    <w:p>
+      <w:pPr>
+        <w:rPr>
+          <w:b/>
+          <w:bCs/>
+          <w:sz w:val="24"/>
+          <w:szCs w:val="24"/>
+        </w:rPr>
+      </w:pPr>
+      <w:r>
+        <w:rPr>
+          <w:b/>
+          <w:bCs/>
+          <w:sz w:val="24"/>
+          <w:szCs w:val="24"/>
+        </w:rPr>
+        <w:t>PROBLEM STATEMENT:</w:t>
+      </w:r>
+    </w:p>
+    <w:p>
+      <w:r>
+        <w:t>You have been provided with three datasets:</w:t>
+      </w:r>
+    </w:p>
+    <w:p>
+      <w:r>
+        <w:t>1. Student performance data (CSV file)</w:t>
+      </w:r>
+      <w:r>
+        <w:t xml:space="preserve"> - </w:t>
+      </w:r>
+      <w:r>
+        <w:t xml:space="preserve">Contains demographic, social, family, and academic information of students. Used to </w:t>
+      </w:r>
+      <w:proofErr w:type="spellStart"/>
+      <w:r>
+        <w:t>analyze</w:t>
+      </w:r>
+      <w:proofErr w:type="spellEnd"/>
+      <w:r>
+        <w:t xml:space="preserve"> factors affecting student performance and predict final grades.</w:t>
+      </w:r>
+    </w:p>
+    <w:p>
+      <w:r>
+        <w:t>Rows - 395 and Columns - 33</w:t>
+      </w:r>
+    </w:p>
+    <w:p>
+      <w:r>
+        <w:t>https://www.kaggle.com/datasets/devansodariya/student-performance-data</w:t>
+      </w:r>
+    </w:p>
+    <w:p>
+      <w:r>
+        <w:t>2. Movie reviews (Text file)</w:t>
+      </w:r>
+      <w:r>
+        <w:t xml:space="preserve"> - </w:t>
+      </w:r>
+      <w:r>
+        <w:t>Contains movie reviews collected from IMDb along with sentiment labels (positive/negative). Used for sentiment analysis and text mining tasks.</w:t>
+      </w:r>
+    </w:p>
+    <w:p>
+      <w:r>
+        <w:t xml:space="preserve">Rows </w:t>
+      </w:r>
+      <w:r>
+        <w:t>-</w:t>
+      </w:r>
+      <w:r>
+        <w:t xml:space="preserve"> </w:t>
+      </w:r>
+      <w:r>
+        <w:t xml:space="preserve">50000 </w:t>
+      </w:r>
+      <w:r>
+        <w:t xml:space="preserve">and Columns - </w:t>
+      </w:r>
+      <w:r>
+        <w:t>2</w:t>
+      </w:r>
+    </w:p>
+    <w:p>
+      <w:r>
+        <w:t>https://www.kaggle.com/datasets/lakshmi25npathi/imdb-dataset-of-50k-movie-</w:t>
+      </w:r>
+    </w:p>
+    <w:p>
+      <w:r>
+        <w:t>reviews</w:t>
+      </w:r>
+    </w:p>
+    <w:p>
+      <w:r>
+        <w:t>3. Image dataset</w:t>
+      </w:r>
+      <w:r>
+        <w:t xml:space="preserve"> - </w:t>
+      </w:r>
+      <w:r>
+        <w:t xml:space="preserve">A collection of small </w:t>
+      </w:r>
+      <w:proofErr w:type="spellStart"/>
+      <w:r>
+        <w:t>color</w:t>
+      </w:r>
+      <w:proofErr w:type="spellEnd"/>
+      <w:r>
+        <w:t xml:space="preserve"> images belonging to 10 different classes such as airplane, automobile, bird, cat, deer, dog, frog, horse, ship, and truck. Used for image classification and computer vision tasks.</w:t>
+      </w:r>
+    </w:p>
+    <w:p>
+      <w:r>
+        <w:t>Images - 60000</w:t>
+      </w:r>
+    </w:p>
+    <w:p>
+      <w:r>
+        <w:t>https://www.cs.toronto.edu/~kriz/cifar.html</w:t>
+      </w:r>
+    </w:p>
+    <w:p/>
+    <w:p>
+      <w:r>
+        <w:t>Perform exploratory analysis on each dataset and identify its characteristics.</w:t>
+      </w:r>
+    </w:p>
+    <w:p>
+      <w:pPr>
+        <w:rPr>
+          <w:b/>
+          <w:bCs/>
+          <w:sz w:val="24"/>
+          <w:szCs w:val="24"/>
+        </w:rPr>
+      </w:pPr>
+      <w:r>
+        <w:rPr>
+          <w:b/>
+          <w:bCs/>
+          <w:sz w:val="24"/>
+          <w:szCs w:val="24"/>
+        </w:rPr>
+        <w:t>PART A – TABULAR DATA</w:t>
+      </w:r>
+    </w:p>
+    <w:p>
+      <w:r>
+        <w:t>Using the student performance dataset:</w:t>
+      </w:r>
+    </w:p>
+    <w:p>
+      <w:r>
+        <w:t>1. Load the dataset.</w:t>
+      </w:r>
+    </w:p>
+    <w:p>
+      <w:r>
+        <w:t>2. Display the first 10 records.</w:t>
+      </w:r>
+    </w:p>
+    <w:p>
+      <w:r>
+        <w:t>3. Identify the number of rows and columns.</w:t>
+      </w:r>
+    </w:p>
+    <w:p>
+      <w:r>
+        <w:t>4. List all attributes.</w:t>
+      </w:r>
+    </w:p>
+    <w:p>
+      <w:r>
+        <w:t>5. Check for missing values.</w:t>
+      </w:r>
+    </w:p>
+    <w:p>
+      <w:r>
+        <w:t>6. Compute basic statistics such as mean, median, minimum, and maximum marks.</w:t>
+      </w:r>
+    </w:p>
+    <w:p>
+      <w:r>
+        <w:t>7. Identify numerical and categorical attributes.</w:t>
+      </w:r>
+    </w:p>
+    <w:p>
+      <w:r>
+        <w:t>8. Draw a histogram of marks.</w:t>
+      </w:r>
+    </w:p>
+    <w:p>
+      <w:r>
+        <w:t>9. Find correlation between numerical attributes.</w:t>
+      </w:r>
+    </w:p>
+    <w:p>
+      <w:r>
+        <w:t>10. Identify possible target variables for prediction.</w:t>
+      </w:r>
+    </w:p>
+    <w:p/>
+    <w:p>
+      <w:pPr>
+        <w:rPr>
+          <w:b/>
+          <w:bCs/>
+          <w:sz w:val="24"/>
+          <w:szCs w:val="24"/>
+        </w:rPr>
+      </w:pPr>
+      <w:r>
+        <w:rPr>
+          <w:b/>
+          <w:bCs/>
+          <w:sz w:val="24"/>
+          <w:szCs w:val="24"/>
+        </w:rPr>
+        <w:lastRenderedPageBreak/>
+        <w:t>CODE:</w:t>
+      </w:r>
+    </w:p>
+    <w:p>
+      <w:r>
+        <w:t># 1. Load the dataset</w:t>
+      </w:r>
+    </w:p>
+    <w:p>
+      <w:r>
+        <w:t>import pandas as pd</w:t>
+      </w:r>
+    </w:p>
+    <w:p>
+      <w:r>
+        <w:t xml:space="preserve">import </w:t>
+      </w:r>
+      <w:proofErr w:type="spellStart"/>
+      <w:proofErr w:type="gramStart"/>
+      <w:r>
+        <w:t>matplotlib.pyplot</w:t>
+      </w:r>
+      <w:proofErr w:type="spellEnd"/>
+      <w:proofErr w:type="gramEnd"/>
+      <w:r>
+        <w:t xml:space="preserve"> as </w:t>
+      </w:r>
+      <w:proofErr w:type="spellStart"/>
+      <w:r>
+        <w:t>plt</w:t>
+      </w:r>
+      <w:proofErr w:type="spellEnd"/>
+    </w:p>
+    <w:p>
+      <w:r>
+        <w:t xml:space="preserve">import seaborn as </w:t>
+      </w:r>
+      <w:proofErr w:type="spellStart"/>
+      <w:r>
+        <w:t>sns</w:t>
+      </w:r>
+      <w:proofErr w:type="spellEnd"/>
+    </w:p>
+    <w:p>
+      <w:proofErr w:type="spellStart"/>
+      <w:r>
+        <w:t>df</w:t>
+      </w:r>
+      <w:proofErr w:type="spellEnd"/>
+      <w:r>
+        <w:t xml:space="preserve"> = </w:t>
+      </w:r>
+      <w:proofErr w:type="spellStart"/>
+      <w:proofErr w:type="gramStart"/>
+      <w:r>
+        <w:t>pd.read</w:t>
+      </w:r>
+      <w:proofErr w:type="gramEnd"/>
+      <w:r>
+        <w:t>_csv</w:t>
+      </w:r>
+      <w:proofErr w:type="spellEnd"/>
+      <w:r>
+        <w:t>(</w:t>
+      </w:r>
+      <w:proofErr w:type="spellStart"/>
+      <w:r>
+        <w:rPr>
+          <w:i/>
+          <w:iCs/>
+        </w:rPr>
+        <w:t>r</w:t>
+      </w:r>
+      <w:r>
+        <w:t>"D</w:t>
+      </w:r>
+      <w:proofErr w:type="spellEnd"/>
+      <w:r>
+        <w:t>:\SEM_5\ML\datasets\Table_data\student_data.csv")</w:t>
+      </w:r>
+    </w:p>
+    <w:p/>
+    <w:p>
+      <w:r>
+        <w:t># 2. Display the first 10 records</w:t>
+      </w:r>
+    </w:p>
+    <w:p>
+      <w:proofErr w:type="gramStart"/>
+      <w:r>
+        <w:rPr>
+          <w:b/>
+          <w:bCs/>
+        </w:rPr>
+        <w:t>print</w:t>
+      </w:r>
+      <w:r>
+        <w:t>(</w:t>
+      </w:r>
+      <w:proofErr w:type="gramEnd"/>
+      <w:r>
+        <w:t>"First 10 Records:")</w:t>
+      </w:r>
+    </w:p>
+    <w:p>
+      <w:r>
+        <w:rPr>
+          <w:b/>
+          <w:bCs/>
+        </w:rPr>
+        <w:t>print</w:t>
+      </w:r>
+      <w:r>
+        <w:t>(</w:t>
+      </w:r>
+      <w:proofErr w:type="spellStart"/>
+      <w:proofErr w:type="gramStart"/>
+      <w:r>
+        <w:t>df.head</w:t>
+      </w:r>
+      <w:proofErr w:type="spellEnd"/>
+      <w:proofErr w:type="gramEnd"/>
+      <w:r>
+        <w:t>(10))</w:t>
+      </w:r>
+    </w:p>
+    <w:p/>
+    <w:p>
+      <w:r>
+        <w:t># 3. Number of rows and columns</w:t>
+      </w:r>
+    </w:p>
+    <w:p>
+      <w:r>
+        <w:t xml:space="preserve">rows, cols = </w:t>
+      </w:r>
+      <w:proofErr w:type="spellStart"/>
+      <w:proofErr w:type="gramStart"/>
+      <w:r>
+        <w:t>df.shape</w:t>
+      </w:r>
+      <w:proofErr w:type="spellEnd"/>
+      <w:proofErr w:type="gramEnd"/>
+    </w:p>
+    <w:p>
+      <w:proofErr w:type="gramStart"/>
+      <w:r>
+        <w:rPr>
+          <w:b/>
+          <w:bCs/>
+        </w:rPr>
+        <w:t>print</w:t>
+      </w:r>
+      <w:r>
+        <w:t>(</w:t>
+      </w:r>
+      <w:proofErr w:type="gramEnd"/>
+      <w:r>
+        <w:t>"\</w:t>
+      </w:r>
+      <w:proofErr w:type="spellStart"/>
+      <w:r>
+        <w:t>nNumber</w:t>
+      </w:r>
+      <w:proofErr w:type="spellEnd"/>
+      <w:r>
+        <w:t xml:space="preserve"> of Rows:", rows)</w:t>
+      </w:r>
+    </w:p>
+    <w:p>
+      <w:proofErr w:type="gramStart"/>
+      <w:r>
+        <w:rPr>
+          <w:b/>
+          <w:bCs/>
+        </w:rPr>
+        <w:t>print</w:t>
+      </w:r>
+      <w:r>
+        <w:t>(</w:t>
+      </w:r>
+      <w:proofErr w:type="gramEnd"/>
+      <w:r>
+        <w:t>"Number of Columns:", cols)</w:t>
+      </w:r>
+    </w:p>
+    <w:p/>
+    <w:p>
+      <w:r>
+        <w:t># 4. List all attributes</w:t>
+      </w:r>
+    </w:p>
+    <w:p>
+      <w:proofErr w:type="gramStart"/>
+      <w:r>
+        <w:rPr>
+          <w:b/>
+          <w:bCs/>
+        </w:rPr>
+        <w:t>print</w:t>
+      </w:r>
+      <w:r>
+        <w:t>(</w:t>
+      </w:r>
+      <w:proofErr w:type="gramEnd"/>
+      <w:r>
+        <w:t>"\</w:t>
+      </w:r>
+      <w:proofErr w:type="spellStart"/>
+      <w:r>
+        <w:t>nAttributes</w:t>
+      </w:r>
+      <w:proofErr w:type="spellEnd"/>
+      <w:r>
+        <w:t xml:space="preserve"> (Columns):")</w:t>
+      </w:r>
+    </w:p>
+    <w:p>
+      <w:r>
+        <w:rPr>
+          <w:b/>
+          <w:bCs/>
+        </w:rPr>
+        <w:t>print</w:t>
+      </w:r>
+      <w:r>
+        <w:t>(</w:t>
+      </w:r>
+      <w:proofErr w:type="spellStart"/>
+      <w:proofErr w:type="gramStart"/>
+      <w:r>
+        <w:t>df.columns</w:t>
+      </w:r>
+      <w:proofErr w:type="gramEnd"/>
+      <w:r>
+        <w:t>.</w:t>
+      </w:r>
+      <w:proofErr w:type="gramStart"/>
+      <w:r>
+        <w:t>tolist</w:t>
+      </w:r>
+      <w:proofErr w:type="spellEnd"/>
+      <w:r>
+        <w:t>(</w:t>
+      </w:r>
+      <w:proofErr w:type="gramEnd"/>
+      <w:r>
+        <w:t>))</w:t>
+      </w:r>
+    </w:p>
+    <w:p/>
+    <w:p>
+      <w:r>
+        <w:t># 5. Check for missing values</w:t>
+      </w:r>
+    </w:p>
+    <w:p>
+      <w:proofErr w:type="gramStart"/>
+      <w:r>
+        <w:rPr>
+          <w:b/>
+          <w:bCs/>
+        </w:rPr>
+        <w:t>print</w:t>
+      </w:r>
+      <w:r>
+        <w:t>(</w:t>
+      </w:r>
+      <w:proofErr w:type="gramEnd"/>
+      <w:r>
+        <w:t>"\</w:t>
+      </w:r>
+      <w:proofErr w:type="spellStart"/>
+      <w:r>
+        <w:t>nMissing</w:t>
+      </w:r>
+      <w:proofErr w:type="spellEnd"/>
+      <w:r>
+        <w:t xml:space="preserve"> Values:")</w:t>
+      </w:r>
+    </w:p>
+    <w:p>
+      <w:r>
+        <w:rPr>
+          <w:b/>
+          <w:bCs/>
+        </w:rPr>
+        <w:t>print</w:t>
+      </w:r>
+      <w:r>
+        <w:t>(</w:t>
+      </w:r>
+      <w:proofErr w:type="spellStart"/>
+      <w:proofErr w:type="gramStart"/>
+      <w:r>
+        <w:t>df.isnull</w:t>
+      </w:r>
+      <w:proofErr w:type="spellEnd"/>
+      <w:proofErr w:type="gramEnd"/>
+      <w:r>
+        <w:t>(</w:t>
+      </w:r>
+      <w:proofErr w:type="gramStart"/>
+      <w:r>
+        <w:t>).sum</w:t>
+      </w:r>
+      <w:proofErr w:type="gramEnd"/>
+      <w:r>
+        <w:t>())</w:t>
+      </w:r>
+    </w:p>
+    <w:p>
+      <w:r>
+        <w:t># Total missing values</w:t>
+      </w:r>
+    </w:p>
+    <w:p>
+      <w:proofErr w:type="gramStart"/>
+      <w:r>
+        <w:rPr>
+          <w:b/>
+          <w:bCs/>
+        </w:rPr>
+        <w:t>print</w:t>
+      </w:r>
+      <w:r>
+        <w:t>(</w:t>
+      </w:r>
+      <w:proofErr w:type="gramEnd"/>
+      <w:r>
+        <w:t>"\</w:t>
+      </w:r>
+      <w:proofErr w:type="spellStart"/>
+      <w:r>
+        <w:t>nTotal</w:t>
+      </w:r>
+      <w:proofErr w:type="spellEnd"/>
+      <w:r>
+        <w:t xml:space="preserve"> Missing Values:", </w:t>
+      </w:r>
+      <w:proofErr w:type="spellStart"/>
+      <w:proofErr w:type="gramStart"/>
+      <w:r>
+        <w:t>df.isnull</w:t>
+      </w:r>
+      <w:proofErr w:type="spellEnd"/>
+      <w:proofErr w:type="gramEnd"/>
+      <w:r>
+        <w:t>(</w:t>
+      </w:r>
+      <w:proofErr w:type="gramStart"/>
+      <w:r>
+        <w:t>).sum</w:t>
+      </w:r>
+      <w:proofErr w:type="gramEnd"/>
+      <w:r>
+        <w:t>(</w:t>
+      </w:r>
+      <w:proofErr w:type="gramStart"/>
+      <w:r>
+        <w:t>).sum</w:t>
+      </w:r>
+      <w:proofErr w:type="gramEnd"/>
+      <w:r>
+        <w:t>())</w:t>
+      </w:r>
+    </w:p>
+    <w:p/>
+    <w:p>
+      <w:r>
+        <w:t># 6. Basic Statistics for Marks Column (G3)</w:t>
+      </w:r>
+    </w:p>
+    <w:p>
+      <w:proofErr w:type="gramStart"/>
+      <w:r>
+        <w:rPr>
+          <w:b/>
+          <w:bCs/>
+        </w:rPr>
+        <w:t>print</w:t>
+      </w:r>
+      <w:r>
+        <w:t>(</w:t>
+      </w:r>
+      <w:proofErr w:type="gramEnd"/>
+      <w:r>
+        <w:t>"\</w:t>
+      </w:r>
+      <w:proofErr w:type="spellStart"/>
+      <w:r>
+        <w:t>nBasic</w:t>
+      </w:r>
+      <w:proofErr w:type="spellEnd"/>
+      <w:r>
+        <w:t xml:space="preserve"> Statistics for Marks (G3):")</w:t>
+      </w:r>
+    </w:p>
+    <w:p>
+      <w:proofErr w:type="gramStart"/>
+      <w:r>
+        <w:rPr>
+          <w:b/>
+          <w:bCs/>
+        </w:rPr>
+        <w:t>print</w:t>
+      </w:r>
+      <w:r>
+        <w:t>(</w:t>
+      </w:r>
+      <w:proofErr w:type="gramEnd"/>
+      <w:r>
+        <w:t xml:space="preserve">"Mean Marks:", </w:t>
+      </w:r>
+      <w:proofErr w:type="spellStart"/>
+      <w:r>
+        <w:t>df</w:t>
+      </w:r>
+      <w:proofErr w:type="spellEnd"/>
+      <w:r>
+        <w:t>['G3'</w:t>
+      </w:r>
+      <w:proofErr w:type="gramStart"/>
+      <w:r>
+        <w:t>].mean</w:t>
+      </w:r>
+      <w:proofErr w:type="gramEnd"/>
+      <w:r>
+        <w:t>())</w:t>
+      </w:r>
+    </w:p>
+    <w:p>
+      <w:proofErr w:type="gramStart"/>
+      <w:r>
+        <w:rPr>
+          <w:b/>
+          <w:bCs/>
+        </w:rPr>
+        <w:t>print</w:t>
+      </w:r>
+      <w:r>
+        <w:t>(</w:t>
+      </w:r>
+      <w:proofErr w:type="gramEnd"/>
+      <w:r>
+        <w:t xml:space="preserve">"Median Marks:", </w:t>
+      </w:r>
+      <w:proofErr w:type="spellStart"/>
+      <w:r>
+        <w:t>df</w:t>
+      </w:r>
+      <w:proofErr w:type="spellEnd"/>
+      <w:r>
+        <w:t>['G3'</w:t>
+      </w:r>
+      <w:proofErr w:type="gramStart"/>
+      <w:r>
+        <w:t>].median</w:t>
+      </w:r>
+      <w:proofErr w:type="gramEnd"/>
+      <w:r>
+        <w:t>())</w:t>
+      </w:r>
+    </w:p>
+    <w:p>
+      <w:proofErr w:type="gramStart"/>
+      <w:r>
+        <w:rPr>
+          <w:b/>
+          <w:bCs/>
+        </w:rPr>
+        <w:t>print</w:t>
+      </w:r>
+      <w:r>
+        <w:t>(</w:t>
+      </w:r>
+      <w:proofErr w:type="gramEnd"/>
+      <w:r>
+        <w:t xml:space="preserve">"Minimum Marks:", </w:t>
+      </w:r>
+      <w:proofErr w:type="spellStart"/>
+      <w:r>
+        <w:t>df</w:t>
+      </w:r>
+      <w:proofErr w:type="spellEnd"/>
+      <w:r>
+        <w:t>['G3'</w:t>
+      </w:r>
+      <w:proofErr w:type="gramStart"/>
+      <w:r>
+        <w:t>].min</w:t>
+      </w:r>
+      <w:proofErr w:type="gramEnd"/>
+      <w:r>
+        <w:t>())</w:t>
+      </w:r>
+    </w:p>
+    <w:p>
+      <w:proofErr w:type="gramStart"/>
+      <w:r>
+        <w:rPr>
+          <w:b/>
+          <w:bCs/>
+        </w:rPr>
+        <w:t>print</w:t>
+      </w:r>
+      <w:r>
+        <w:t>(</w:t>
+      </w:r>
+      <w:proofErr w:type="gramEnd"/>
+      <w:r>
+        <w:t xml:space="preserve">"Maximum Marks:", </w:t>
+      </w:r>
+      <w:proofErr w:type="spellStart"/>
+      <w:r>
+        <w:t>df</w:t>
+      </w:r>
+      <w:proofErr w:type="spellEnd"/>
+      <w:r>
+        <w:t>['G3'].</w:t>
+      </w:r>
+      <w:proofErr w:type="gramStart"/>
+      <w:r>
+        <w:t>max(</w:t>
+      </w:r>
+      <w:proofErr w:type="gramEnd"/>
+      <w:r>
+        <w:t>))</w:t>
+      </w:r>
+    </w:p>
+    <w:p/>
+    <w:p/>
+    <w:p>
+      <w:r>
+        <w:lastRenderedPageBreak/>
+        <w:t># 7. Identify Numerical and Categorical Attributes</w:t>
+      </w:r>
+    </w:p>
+    <w:p>
+      <w:proofErr w:type="spellStart"/>
+      <w:r>
+        <w:t>numerical_cols</w:t>
+      </w:r>
+      <w:proofErr w:type="spellEnd"/>
+      <w:r>
+        <w:t xml:space="preserve"> = </w:t>
+      </w:r>
+      <w:proofErr w:type="spellStart"/>
+      <w:proofErr w:type="gramStart"/>
+      <w:r>
+        <w:t>df.select</w:t>
+      </w:r>
+      <w:proofErr w:type="gramEnd"/>
+      <w:r>
+        <w:t>_</w:t>
+      </w:r>
+      <w:proofErr w:type="gramStart"/>
+      <w:r>
+        <w:t>dtypes</w:t>
+      </w:r>
+      <w:proofErr w:type="spellEnd"/>
+      <w:r>
+        <w:t>(</w:t>
+      </w:r>
+      <w:proofErr w:type="gramEnd"/>
+      <w:r>
+        <w:rPr>
+          <w:i/>
+          <w:iCs/>
+        </w:rPr>
+        <w:t>include</w:t>
+      </w:r>
+      <w:proofErr w:type="gramStart"/>
+      <w:r>
+        <w:t>=[</w:t>
+      </w:r>
+      <w:proofErr w:type="gramEnd"/>
+      <w:r>
+        <w:t>'int64', 'float64']</w:t>
+      </w:r>
+      <w:proofErr w:type="gramStart"/>
+      <w:r>
+        <w:t>).columns</w:t>
+      </w:r>
+      <w:proofErr w:type="gramEnd"/>
+    </w:p>
+    <w:p>
+      <w:proofErr w:type="spellStart"/>
+      <w:r>
+        <w:t>categorical_cols</w:t>
+      </w:r>
+      <w:proofErr w:type="spellEnd"/>
+      <w:r>
+        <w:t xml:space="preserve"> = </w:t>
+      </w:r>
+      <w:proofErr w:type="spellStart"/>
+      <w:proofErr w:type="gramStart"/>
+      <w:r>
+        <w:t>df.select</w:t>
+      </w:r>
+      <w:proofErr w:type="gramEnd"/>
+      <w:r>
+        <w:t>_dtypes</w:t>
+      </w:r>
+      <w:proofErr w:type="spellEnd"/>
+      <w:r>
+        <w:t>(</w:t>
+      </w:r>
+      <w:r>
+        <w:rPr>
+          <w:i/>
+          <w:iCs/>
+        </w:rPr>
+        <w:t>include</w:t>
+      </w:r>
+      <w:r>
+        <w:t>=['object']</w:t>
+      </w:r>
+      <w:proofErr w:type="gramStart"/>
+      <w:r>
+        <w:t>).columns</w:t>
+      </w:r>
+      <w:proofErr w:type="gramEnd"/>
+    </w:p>
+    <w:p>
+      <w:proofErr w:type="gramStart"/>
+      <w:r>
+        <w:rPr>
+          <w:b/>
+          <w:bCs/>
+        </w:rPr>
+        <w:t>print</w:t>
+      </w:r>
+      <w:r>
+        <w:t>(</w:t>
+      </w:r>
+      <w:proofErr w:type="gramEnd"/>
+      <w:r>
+        <w:t>"\</w:t>
+      </w:r>
+      <w:proofErr w:type="spellStart"/>
+      <w:r>
+        <w:t>nNumerical</w:t>
+      </w:r>
+      <w:proofErr w:type="spellEnd"/>
+      <w:r>
+        <w:t xml:space="preserve"> Attributes:")</w:t>
+      </w:r>
+    </w:p>
+    <w:p>
+      <w:r>
+        <w:rPr>
+          <w:b/>
+          <w:bCs/>
+        </w:rPr>
+        <w:t>print</w:t>
+      </w:r>
+      <w:r>
+        <w:t>(</w:t>
+      </w:r>
+      <w:r>
+        <w:rPr>
+          <w:i/>
+          <w:iCs/>
+        </w:rPr>
+        <w:t>list</w:t>
+      </w:r>
+      <w:r>
+        <w:t>(</w:t>
+      </w:r>
+      <w:proofErr w:type="spellStart"/>
+      <w:r>
+        <w:t>numerical_cols</w:t>
+      </w:r>
+      <w:proofErr w:type="spellEnd"/>
+      <w:r>
+        <w:t>))</w:t>
+      </w:r>
+    </w:p>
+    <w:p>
+      <w:proofErr w:type="gramStart"/>
+      <w:r>
+        <w:rPr>
+          <w:b/>
+          <w:bCs/>
+        </w:rPr>
+        <w:t>print</w:t>
+      </w:r>
+      <w:r>
+        <w:t>(</w:t>
+      </w:r>
+      <w:proofErr w:type="gramEnd"/>
+      <w:r>
+        <w:t>"\</w:t>
+      </w:r>
+      <w:proofErr w:type="spellStart"/>
+      <w:r>
+        <w:t>nCategorical</w:t>
+      </w:r>
+      <w:proofErr w:type="spellEnd"/>
+      <w:r>
+        <w:t xml:space="preserve"> Attributes:")</w:t>
+      </w:r>
+    </w:p>
+    <w:p>
+      <w:r>
+        <w:rPr>
+          <w:b/>
+          <w:bCs/>
+        </w:rPr>
+        <w:t>print</w:t>
+      </w:r>
+      <w:r>
+        <w:t>(</w:t>
+      </w:r>
+      <w:r>
+        <w:rPr>
+          <w:i/>
+          <w:iCs/>
+        </w:rPr>
+        <w:t>list</w:t>
+      </w:r>
+      <w:r>
+        <w:t>(</w:t>
+      </w:r>
+      <w:proofErr w:type="spellStart"/>
+      <w:r>
+        <w:t>categorical_cols</w:t>
+      </w:r>
+      <w:proofErr w:type="spellEnd"/>
+      <w:r>
+        <w:t>))</w:t>
+      </w:r>
+    </w:p>
+    <w:p/>
+    <w:p>
+      <w:r>
+        <w:t># 8. Draw Histogram of Marks</w:t>
+      </w:r>
+    </w:p>
+    <w:p>
+      <w:r>
+        <w:t xml:space="preserve">if 'G3' in </w:t>
+      </w:r>
+      <w:proofErr w:type="spellStart"/>
+      <w:proofErr w:type="gramStart"/>
+      <w:r>
+        <w:t>df.columns</w:t>
+      </w:r>
+      <w:proofErr w:type="spellEnd"/>
+      <w:proofErr w:type="gramEnd"/>
+      <w:r>
+        <w:t>:</w:t>
+      </w:r>
+    </w:p>
+    <w:p>
+      <w:r>
+        <w:t xml:space="preserve">    </w:t>
+      </w:r>
+      <w:proofErr w:type="spellStart"/>
+      <w:proofErr w:type="gramStart"/>
+      <w:r>
+        <w:t>plt.figure</w:t>
+      </w:r>
+      <w:proofErr w:type="spellEnd"/>
+      <w:proofErr w:type="gramEnd"/>
+      <w:r>
+        <w:t>(</w:t>
+      </w:r>
+      <w:proofErr w:type="spellStart"/>
+      <w:r>
+        <w:rPr>
+          <w:i/>
+          <w:iCs/>
+        </w:rPr>
+        <w:t>figsize</w:t>
+      </w:r>
+      <w:proofErr w:type="spellEnd"/>
+      <w:proofErr w:type="gramStart"/>
+      <w:r>
+        <w:t>=(</w:t>
+      </w:r>
+      <w:proofErr w:type="gramEnd"/>
+      <w:r>
+        <w:t>8,5))</w:t>
+      </w:r>
+    </w:p>
+    <w:p>
+      <w:r>
+        <w:t xml:space="preserve">    </w:t>
+      </w:r>
+      <w:proofErr w:type="spellStart"/>
+      <w:proofErr w:type="gramStart"/>
+      <w:r>
+        <w:t>plt.hist</w:t>
+      </w:r>
+      <w:proofErr w:type="spellEnd"/>
+      <w:proofErr w:type="gramEnd"/>
+      <w:r>
+        <w:t>(</w:t>
+      </w:r>
+      <w:proofErr w:type="spellStart"/>
+      <w:r>
+        <w:t>df</w:t>
+      </w:r>
+      <w:proofErr w:type="spellEnd"/>
+      <w:r>
+        <w:t xml:space="preserve">['G3'], </w:t>
+      </w:r>
+      <w:r>
+        <w:rPr>
+          <w:i/>
+          <w:iCs/>
+        </w:rPr>
+        <w:t>bins</w:t>
+      </w:r>
+      <w:r>
+        <w:t>=10)</w:t>
+      </w:r>
+    </w:p>
+    <w:p>
+      <w:r>
+        <w:t xml:space="preserve">    </w:t>
+      </w:r>
+      <w:proofErr w:type="spellStart"/>
+      <w:proofErr w:type="gramStart"/>
+      <w:r>
+        <w:t>plt.title</w:t>
+      </w:r>
+      <w:proofErr w:type="spellEnd"/>
+      <w:proofErr w:type="gramEnd"/>
+      <w:r>
+        <w:t>("Histogram of Final Grade (G3)")</w:t>
+      </w:r>
+    </w:p>
+    <w:p>
+      <w:r>
+        <w:t xml:space="preserve">    </w:t>
+      </w:r>
+      <w:proofErr w:type="spellStart"/>
+      <w:proofErr w:type="gramStart"/>
+      <w:r>
+        <w:t>plt.xlabel</w:t>
+      </w:r>
+      <w:proofErr w:type="spellEnd"/>
+      <w:proofErr w:type="gramEnd"/>
+      <w:r>
+        <w:t>("G3 Marks")</w:t>
+      </w:r>
+    </w:p>
+    <w:p>
+      <w:r>
+        <w:t xml:space="preserve">    </w:t>
+      </w:r>
+      <w:proofErr w:type="spellStart"/>
+      <w:proofErr w:type="gramStart"/>
+      <w:r>
+        <w:t>plt.ylabel</w:t>
+      </w:r>
+      <w:proofErr w:type="spellEnd"/>
+      <w:proofErr w:type="gramEnd"/>
+      <w:r>
+        <w:t>("Frequency")</w:t>
+      </w:r>
+    </w:p>
+    <w:p>
+      <w:r>
+        <w:t xml:space="preserve">    </w:t>
+      </w:r>
+      <w:proofErr w:type="spellStart"/>
+      <w:proofErr w:type="gramStart"/>
+      <w:r>
+        <w:t>plt.grid</w:t>
+      </w:r>
+      <w:proofErr w:type="spellEnd"/>
+      <w:proofErr w:type="gramEnd"/>
+      <w:r>
+        <w:t>(True)</w:t>
+      </w:r>
+    </w:p>
+    <w:p>
+      <w:r>
+        <w:t xml:space="preserve">    </w:t>
+      </w:r>
+      <w:proofErr w:type="spellStart"/>
+      <w:proofErr w:type="gramStart"/>
+      <w:r>
+        <w:t>plt.show</w:t>
+      </w:r>
+      <w:proofErr w:type="spellEnd"/>
+      <w:proofErr w:type="gramEnd"/>
+      <w:r>
+        <w:t>()</w:t>
+      </w:r>
+    </w:p>
+    <w:p>
+      <w:r>
+        <w:t>else:</w:t>
+      </w:r>
+    </w:p>
+    <w:p>
+      <w:r>
+        <w:t xml:space="preserve">    </w:t>
+      </w:r>
+      <w:proofErr w:type="gramStart"/>
+      <w:r>
+        <w:rPr>
+          <w:b/>
+          <w:bCs/>
+        </w:rPr>
+        <w:t>print</w:t>
+      </w:r>
+      <w:r>
+        <w:t>(</w:t>
+      </w:r>
+      <w:proofErr w:type="gramEnd"/>
+      <w:r>
+        <w:t>"\</w:t>
+      </w:r>
+      <w:proofErr w:type="spellStart"/>
+      <w:r>
+        <w:t>nColumn</w:t>
+      </w:r>
+      <w:proofErr w:type="spellEnd"/>
+      <w:r>
+        <w:t xml:space="preserve"> 'G3' not found. Use the appropriate marks column.")</w:t>
+      </w:r>
+    </w:p>
+    <w:p/>
+    <w:p>
+      <w:r>
+        <w:t># 9. Correlation Between Numerical Attributes</w:t>
+      </w:r>
+    </w:p>
+    <w:p>
+      <w:proofErr w:type="spellStart"/>
+      <w:r>
+        <w:t>correlation_matrix</w:t>
+      </w:r>
+      <w:proofErr w:type="spellEnd"/>
+      <w:r>
+        <w:t xml:space="preserve"> = </w:t>
+      </w:r>
+      <w:proofErr w:type="spellStart"/>
+      <w:r>
+        <w:t>df</w:t>
+      </w:r>
+      <w:proofErr w:type="spellEnd"/>
+      <w:r>
+        <w:t>[</w:t>
+      </w:r>
+      <w:proofErr w:type="spellStart"/>
+      <w:r>
+        <w:t>numerical_cols</w:t>
+      </w:r>
+      <w:proofErr w:type="spellEnd"/>
+      <w:proofErr w:type="gramStart"/>
+      <w:r>
+        <w:t>].</w:t>
+      </w:r>
+      <w:proofErr w:type="spellStart"/>
+      <w:r>
+        <w:t>corr</w:t>
+      </w:r>
+      <w:proofErr w:type="spellEnd"/>
+      <w:proofErr w:type="gramEnd"/>
+      <w:r>
+        <w:t>()</w:t>
+      </w:r>
+    </w:p>
+    <w:p>
+      <w:proofErr w:type="gramStart"/>
+      <w:r>
+        <w:rPr>
+          <w:b/>
+          <w:bCs/>
+        </w:rPr>
+        <w:t>print</w:t>
+      </w:r>
+      <w:r>
+        <w:t>(</w:t>
+      </w:r>
+      <w:proofErr w:type="gramEnd"/>
+      <w:r>
+        <w:t>"\</w:t>
+      </w:r>
+      <w:proofErr w:type="spellStart"/>
+      <w:r>
+        <w:t>nCorrelation</w:t>
+      </w:r>
+      <w:proofErr w:type="spellEnd"/>
+      <w:r>
+        <w:t xml:space="preserve"> Matrix:")</w:t>
+      </w:r>
+    </w:p>
+    <w:p>
+      <w:r>
+        <w:rPr>
+          <w:b/>
+          <w:bCs/>
+        </w:rPr>
+        <w:t>print</w:t>
+      </w:r>
+      <w:r>
+        <w:t>(</w:t>
+      </w:r>
+      <w:proofErr w:type="spellStart"/>
+      <w:r>
+        <w:t>correlation_matrix</w:t>
+      </w:r>
+      <w:proofErr w:type="spellEnd"/>
+      <w:r>
+        <w:t>)</w:t>
+      </w:r>
+    </w:p>
+    <w:p/>
+    <w:p>
+      <w:r>
+        <w:t># 10. Possible Target Variables for Prediction</w:t>
+      </w:r>
+    </w:p>
+    <w:p>
+      <w:proofErr w:type="gramStart"/>
+      <w:r>
+        <w:rPr>
+          <w:b/>
+          <w:bCs/>
+        </w:rPr>
+        <w:t>print</w:t>
+      </w:r>
+      <w:r>
+        <w:t>(</w:t>
+      </w:r>
+      <w:proofErr w:type="gramEnd"/>
+      <w:r>
+        <w:t>"\</w:t>
+      </w:r>
+      <w:proofErr w:type="spellStart"/>
+      <w:r>
+        <w:t>nPossible</w:t>
+      </w:r>
+      <w:proofErr w:type="spellEnd"/>
+      <w:r>
+        <w:t xml:space="preserve"> Target Variables:")</w:t>
+      </w:r>
+    </w:p>
+    <w:p>
+      <w:proofErr w:type="spellStart"/>
+      <w:r>
+        <w:t>possible_targets</w:t>
+      </w:r>
+      <w:proofErr w:type="spellEnd"/>
+      <w:r>
+        <w:t xml:space="preserve"> = []</w:t>
+      </w:r>
+    </w:p>
+    <w:p>
+      <w:r>
+        <w:t>for col in ['G1', 'G2', 'G3']:</w:t>
+      </w:r>
+    </w:p>
+    <w:p>
+      <w:r>
+        <w:t xml:space="preserve">    if col in </w:t>
+      </w:r>
+      <w:proofErr w:type="spellStart"/>
+      <w:proofErr w:type="gramStart"/>
+      <w:r>
+        <w:t>df.columns</w:t>
+      </w:r>
+      <w:proofErr w:type="spellEnd"/>
+      <w:proofErr w:type="gramEnd"/>
+      <w:r>
+        <w:t>:</w:t>
+      </w:r>
+    </w:p>
+    <w:p>
+      <w:r>
+        <w:t xml:space="preserve">        </w:t>
+      </w:r>
+      <w:proofErr w:type="spellStart"/>
+      <w:r>
+        <w:t>possible_</w:t>
+      </w:r>
+      <w:proofErr w:type="gramStart"/>
+      <w:r>
+        <w:t>targets.append</w:t>
+      </w:r>
+      <w:proofErr w:type="spellEnd"/>
+      <w:proofErr w:type="gramEnd"/>
+      <w:r>
+        <w:t>(col)</w:t>
+      </w:r>
+    </w:p>
+    <w:p>
+      <w:r>
+        <w:rPr>
+          <w:b/>
+          <w:bCs/>
+        </w:rPr>
+        <w:t>print</w:t>
+      </w:r>
+      <w:r>
+        <w:t>(</w:t>
+      </w:r>
+      <w:proofErr w:type="spellStart"/>
+      <w:r>
+        <w:t>possible_targets</w:t>
+      </w:r>
+      <w:proofErr w:type="spellEnd"/>
+      <w:r>
+        <w:t>)</w:t>
+      </w:r>
+    </w:p>
+    <w:p/>
+    <w:p/>
+    <w:p>
+      <w:pPr>
+        <w:rPr>
+          <w:b/>
+          <w:bCs/>
+          <w:sz w:val="24"/>
+          <w:szCs w:val="24"/>
+        </w:rPr>
+      </w:pPr>
+      <w:r>
+        <w:rPr>
+          <w:b/>
+          <w:bCs/>
+          <w:sz w:val="24"/>
+          <w:szCs w:val="24"/>
+        </w:rPr>
+        <w:lastRenderedPageBreak/>
+        <w:t>OUTPUT:</w:t>
+      </w:r>
+    </w:p>
+    <w:p>
+      <w:r>
+        <w:t>2</w:t>
+      </w:r>
+      <w:r>
+        <w:t>.</w:t>
+      </w:r>
+    </w:p>
+    <w:p>
+      <w:r>
+        <w:rPr>
+          <w:noProof/>
+        </w:rPr>
         <w:drawing>
           <wp:inline distT="0" distB="0" distL="0" distR="0" wp14:anchorId="6550A786" wp14:editId="0F71085B">
             <wp:extent cx="5731510" cy="1892300"/>
@@ -46,10 +1601,21 @@
     </w:p>
     <w:p>
       <w:r>
+        <w:t>3</w:t>
+      </w:r>
+      <w:r>
+        <w:t>.</w:t>
+      </w:r>
+    </w:p>
+    <w:p>
+      <w:r>
+        <w:rPr>
+          <w:noProof/>
+        </w:rPr>
         <w:drawing>
-          <wp:inline distT="0" distB="0" distL="0" distR="0" wp14:anchorId="21CE9278" wp14:editId="0CD5D7CB">
-            <wp:extent cx="1949550" cy="539778"/>
-            <wp:effectExtent l="0" t="0" r="0" b="0"/>
+          <wp:inline distT="0" distB="0" distL="0" distR="0" wp14:anchorId="21CE9278" wp14:editId="4876E3E4">
+            <wp:extent cx="1536852" cy="425513"/>
+            <wp:effectExtent l="0" t="0" r="6350" b="0"/>
             <wp:docPr id="795011517" name="Picture 1"/>
             <wp:cNvGraphicFramePr>
               <a:graphicFrameLocks xmlns:a="http://schemas.openxmlformats.org/drawingml/2006/main" noChangeAspect="1"/>
@@ -70,7 +1636,7 @@
                   <pic:spPr>
                     <a:xfrm>
                       <a:off x="0" y="0"/>
-                      <a:ext cx="1949550" cy="539778"/>
+                      <a:ext cx="1589873" cy="440193"/>
                     </a:xfrm>
                     <a:prstGeom prst="rect">
                       <a:avLst/>
@@ -83,8 +1649,20 @@
         </w:drawing>
       </w:r>
     </w:p>
-    <w:p>
-      <w:r>
+    <w:p/>
+    <w:p>
+      <w:r>
+        <w:t>4</w:t>
+      </w:r>
+      <w:r>
+        <w:t>.</w:t>
+      </w:r>
+    </w:p>
+    <w:p>
+      <w:r>
+        <w:rPr>
+          <w:noProof/>
+        </w:rPr>
         <w:drawing>
           <wp:inline distT="0" distB="0" distL="0" distR="0" wp14:anchorId="10108EEC" wp14:editId="05F8F4FC">
             <wp:extent cx="5731510" cy="721360"/>
@@ -122,11 +1700,23 @@
         </w:drawing>
       </w:r>
     </w:p>
-    <w:p>
-      <w:r>
+    <w:p/>
+    <w:p>
+      <w:r>
+        <w:t>5</w:t>
+      </w:r>
+      <w:r>
+        <w:t>.</w:t>
+      </w:r>
+    </w:p>
+    <w:p>
+      <w:r>
+        <w:rPr>
+          <w:noProof/>
+        </w:rPr>
         <w:drawing>
-          <wp:inline distT="0" distB="0" distL="0" distR="0" wp14:anchorId="37FDD674" wp14:editId="2018F137">
-            <wp:extent cx="1816193" cy="5855001"/>
+          <wp:inline distT="0" distB="0" distL="0" distR="0" wp14:anchorId="37FDD674" wp14:editId="4CCF4042">
+            <wp:extent cx="1353620" cy="4363770"/>
             <wp:effectExtent l="0" t="0" r="0" b="0"/>
             <wp:docPr id="1834185868" name="Picture 1"/>
             <wp:cNvGraphicFramePr>
@@ -148,7 +1738,7 @@
                   <pic:spPr>
                     <a:xfrm>
                       <a:off x="0" y="0"/>
-                      <a:ext cx="1816193" cy="5855001"/>
+                      <a:ext cx="1385782" cy="4467454"/>
                     </a:xfrm>
                     <a:prstGeom prst="rect">
                       <a:avLst/>
@@ -163,11 +1753,14 @@
     </w:p>
     <w:p>
       <w:r>
+        <w:rPr>
+          <w:noProof/>
+        </w:rPr>
         <w:lastRenderedPageBreak/>
         <w:drawing>
-          <wp:inline distT="0" distB="0" distL="0" distR="0" wp14:anchorId="621D742C" wp14:editId="1EFEA569">
-            <wp:extent cx="1663786" cy="1111307"/>
-            <wp:effectExtent l="0" t="0" r="0" b="0"/>
+          <wp:inline distT="0" distB="0" distL="0" distR="0" wp14:anchorId="621D742C" wp14:editId="1E514470">
+            <wp:extent cx="1165672" cy="778598"/>
+            <wp:effectExtent l="0" t="0" r="0" b="2540"/>
             <wp:docPr id="2103084132" name="Picture 1"/>
             <wp:cNvGraphicFramePr>
               <a:graphicFrameLocks xmlns:a="http://schemas.openxmlformats.org/drawingml/2006/main" noChangeAspect="1"/>
@@ -188,7 +1781,7 @@
                   <pic:spPr>
                     <a:xfrm>
                       <a:off x="0" y="0"/>
-                      <a:ext cx="1663786" cy="1111307"/>
+                      <a:ext cx="1170043" cy="781517"/>
                     </a:xfrm>
                     <a:prstGeom prst="rect">
                       <a:avLst/>
@@ -203,10 +1796,13 @@
     </w:p>
     <w:p>
       <w:r>
+        <w:rPr>
+          <w:noProof/>
+        </w:rPr>
         <w:drawing>
-          <wp:inline distT="0" distB="0" distL="0" distR="0" wp14:anchorId="4E02AF66" wp14:editId="580FC7A7">
-            <wp:extent cx="1968601" cy="228612"/>
-            <wp:effectExtent l="0" t="0" r="0" b="0"/>
+          <wp:inline distT="0" distB="0" distL="0" distR="0" wp14:anchorId="4E02AF66" wp14:editId="76758264">
+            <wp:extent cx="1741335" cy="202220"/>
+            <wp:effectExtent l="0" t="0" r="0" b="7620"/>
             <wp:docPr id="1405436280" name="Picture 1"/>
             <wp:cNvGraphicFramePr>
               <a:graphicFrameLocks xmlns:a="http://schemas.openxmlformats.org/drawingml/2006/main" noChangeAspect="1"/>
@@ -227,7 +1823,7 @@
                   <pic:spPr>
                     <a:xfrm>
                       <a:off x="0" y="0"/>
-                      <a:ext cx="1968601" cy="228612"/>
+                      <a:ext cx="1760013" cy="204389"/>
                     </a:xfrm>
                     <a:prstGeom prst="rect">
                       <a:avLst/>
@@ -242,10 +1838,18 @@
     </w:p>
     <w:p>
       <w:r>
+        <w:t>6.</w:t>
+      </w:r>
+    </w:p>
+    <w:p>
+      <w:r>
+        <w:rPr>
+          <w:noProof/>
+        </w:rPr>
         <w:drawing>
-          <wp:inline distT="0" distB="0" distL="0" distR="0" wp14:anchorId="66A46EF4" wp14:editId="4D417070">
-            <wp:extent cx="2921150" cy="971600"/>
-            <wp:effectExtent l="0" t="0" r="0" b="0"/>
+          <wp:inline distT="0" distB="0" distL="0" distR="0" wp14:anchorId="66A46EF4" wp14:editId="00D39238">
+            <wp:extent cx="2003728" cy="666458"/>
+            <wp:effectExtent l="0" t="0" r="0" b="635"/>
             <wp:docPr id="1624515840" name="Picture 1"/>
             <wp:cNvGraphicFramePr>
               <a:graphicFrameLocks xmlns:a="http://schemas.openxmlformats.org/drawingml/2006/main" noChangeAspect="1"/>
@@ -266,7 +1870,7 @@
                   <pic:spPr>
                     <a:xfrm>
                       <a:off x="0" y="0"/>
-                      <a:ext cx="2921150" cy="971600"/>
+                      <a:ext cx="2019214" cy="671609"/>
                     </a:xfrm>
                     <a:prstGeom prst="rect">
                       <a:avLst/>
@@ -279,12 +1883,21 @@
         </w:drawing>
       </w:r>
     </w:p>
-    <w:p>
-      <w:r>
+    <w:p/>
+    <w:p>
+      <w:r>
+        <w:t>7.</w:t>
+      </w:r>
+    </w:p>
+    <w:p>
+      <w:r>
+        <w:rPr>
+          <w:noProof/>
+        </w:rPr>
         <w:drawing>
-          <wp:inline distT="0" distB="0" distL="0" distR="0" wp14:anchorId="75624CFF" wp14:editId="0874AEDD">
-            <wp:extent cx="5731510" cy="985520"/>
-            <wp:effectExtent l="0" t="0" r="2540" b="5080"/>
+          <wp:inline distT="0" distB="0" distL="0" distR="0" wp14:anchorId="75624CFF" wp14:editId="6BE65D7F">
+            <wp:extent cx="5351227" cy="920131"/>
+            <wp:effectExtent l="0" t="0" r="1905" b="0"/>
             <wp:docPr id="765811496" name="Picture 1"/>
             <wp:cNvGraphicFramePr>
               <a:graphicFrameLocks xmlns:a="http://schemas.openxmlformats.org/drawingml/2006/main" noChangeAspect="1"/>
@@ -305,7 +1918,7 @@
                   <pic:spPr>
                     <a:xfrm>
                       <a:off x="0" y="0"/>
-                      <a:ext cx="5731510" cy="985520"/>
+                      <a:ext cx="5358212" cy="921332"/>
                     </a:xfrm>
                     <a:prstGeom prst="rect">
                       <a:avLst/>
@@ -318,12 +1931,21 @@
         </w:drawing>
       </w:r>
     </w:p>
-    <w:p>
-      <w:r>
+    <w:p/>
+    <w:p>
+      <w:r>
+        <w:t>8.</w:t>
+      </w:r>
+    </w:p>
+    <w:p>
+      <w:r>
+        <w:rPr>
+          <w:noProof/>
+        </w:rPr>
         <w:drawing>
-          <wp:inline distT="0" distB="0" distL="0" distR="0" wp14:anchorId="263F2006" wp14:editId="67B5C60E">
-            <wp:extent cx="5731510" cy="4060825"/>
-            <wp:effectExtent l="0" t="0" r="2540" b="0"/>
+          <wp:inline distT="0" distB="0" distL="0" distR="0" wp14:anchorId="263F2006" wp14:editId="500BE73C">
+            <wp:extent cx="5495453" cy="2286475"/>
+            <wp:effectExtent l="0" t="0" r="0" b="0"/>
             <wp:docPr id="1149862854" name="Picture 1"/>
             <wp:cNvGraphicFramePr>
               <a:graphicFrameLocks xmlns:a="http://schemas.openxmlformats.org/drawingml/2006/main" noChangeAspect="1"/>
@@ -344,7 +1966,7 @@
                   <pic:spPr>
                     <a:xfrm>
                       <a:off x="0" y="0"/>
-                      <a:ext cx="5731510" cy="4060825"/>
+                      <a:ext cx="5602590" cy="2331051"/>
                     </a:xfrm>
                     <a:prstGeom prst="rect">
                       <a:avLst/>
@@ -357,13 +1979,21 @@
         </w:drawing>
       </w:r>
     </w:p>
-    <w:p>
-      <w:r>
-        <w:lastRenderedPageBreak/>
+    <w:p/>
+    <w:p>
+      <w:r>
+        <w:t>9.</w:t>
+      </w:r>
+    </w:p>
+    <w:p>
+      <w:r>
+        <w:rPr>
+          <w:noProof/>
+        </w:rPr>
         <w:drawing>
-          <wp:inline distT="0" distB="0" distL="0" distR="0" wp14:anchorId="7B36B04B" wp14:editId="5AE61EAF">
-            <wp:extent cx="5731510" cy="2566670"/>
-            <wp:effectExtent l="0" t="0" r="2540" b="5080"/>
+          <wp:inline distT="0" distB="0" distL="0" distR="0" wp14:anchorId="7B36B04B" wp14:editId="2CC2F30F">
+            <wp:extent cx="5184658" cy="2321781"/>
+            <wp:effectExtent l="0" t="0" r="0" b="2540"/>
             <wp:docPr id="38167789" name="Picture 1"/>
             <wp:cNvGraphicFramePr>
               <a:graphicFrameLocks xmlns:a="http://schemas.openxmlformats.org/drawingml/2006/main" noChangeAspect="1"/>
@@ -384,7 +2014,7 @@
                   <pic:spPr>
                     <a:xfrm>
                       <a:off x="0" y="0"/>
-                      <a:ext cx="5731510" cy="2566670"/>
+                      <a:ext cx="5228452" cy="2341393"/>
                     </a:xfrm>
                     <a:prstGeom prst="rect">
                       <a:avLst/>
@@ -399,6 +2029,15 @@
     </w:p>
     <w:p>
       <w:r>
+        <w:lastRenderedPageBreak/>
+        <w:t>10.</w:t>
+      </w:r>
+    </w:p>
+    <w:p>
+      <w:r>
+        <w:rPr>
+          <w:noProof/>
+        </w:rPr>
         <w:drawing>
           <wp:inline distT="0" distB="0" distL="0" distR="0" wp14:anchorId="536038EB" wp14:editId="2D74713B">
             <wp:extent cx="2444876" cy="425472"/>
@@ -437,9 +2076,2458 @@
       </w:r>
     </w:p>
     <w:p/>
+    <w:p>
+      <w:pPr>
+        <w:rPr>
+          <w:b/>
+          <w:bCs/>
+          <w:sz w:val="24"/>
+          <w:szCs w:val="24"/>
+        </w:rPr>
+      </w:pPr>
+      <w:r>
+        <w:rPr>
+          <w:b/>
+          <w:bCs/>
+          <w:sz w:val="24"/>
+          <w:szCs w:val="24"/>
+        </w:rPr>
+        <w:t>PART B – TEXT DATA</w:t>
+      </w:r>
+    </w:p>
+    <w:p>
+      <w:r>
+        <w:t>Using the feedback dataset:</w:t>
+      </w:r>
+    </w:p>
+    <w:p>
+      <w:r>
+        <w:t>1. Read the text file.</w:t>
+      </w:r>
+    </w:p>
+    <w:p>
+      <w:r>
+        <w:t>2. Count the number of sentences.</w:t>
+      </w:r>
+    </w:p>
+    <w:p>
+      <w:r>
+        <w:t>3. Count the number of words.</w:t>
+      </w:r>
+    </w:p>
+    <w:p>
+      <w:r>
+        <w:t>4. Find the 10 most frequently occurring words.</w:t>
+      </w:r>
+    </w:p>
+    <w:p>
+      <w:r>
+        <w:t>5. Remove common stop words and compare the results.</w:t>
+      </w:r>
+    </w:p>
+    <w:p>
+      <w:pPr>
+        <w:rPr>
+          <w:b/>
+          <w:bCs/>
+          <w:sz w:val="24"/>
+          <w:szCs w:val="24"/>
+        </w:rPr>
+      </w:pPr>
+      <w:r>
+        <w:rPr>
+          <w:b/>
+          <w:bCs/>
+          <w:sz w:val="24"/>
+          <w:szCs w:val="24"/>
+        </w:rPr>
+        <w:t>ADDITIONAL TEXT ANALYTICS TASK</w:t>
+      </w:r>
+    </w:p>
+    <w:p>
+      <w:r>
+        <w:t>6. Calculate vocabulary size.</w:t>
+      </w:r>
+    </w:p>
+    <w:p>
+      <w:r>
+        <w:t>7. Find average sentence length.</w:t>
+      </w:r>
+    </w:p>
+    <w:p>
+      <w:r>
+        <w:t>8. Generate a word cloud.</w:t>
+      </w:r>
+    </w:p>
+    <w:p/>
+    <w:p>
+      <w:pPr>
+        <w:rPr>
+          <w:b/>
+          <w:bCs/>
+          <w:sz w:val="24"/>
+          <w:szCs w:val="24"/>
+        </w:rPr>
+      </w:pPr>
+      <w:r>
+        <w:rPr>
+          <w:b/>
+          <w:bCs/>
+          <w:sz w:val="24"/>
+          <w:szCs w:val="24"/>
+        </w:rPr>
+        <w:t>CODE:</w:t>
+      </w:r>
+    </w:p>
+    <w:p>
+      <w:r>
+        <w:t>import pandas as pd</w:t>
+      </w:r>
+    </w:p>
+    <w:p>
+      <w:r>
+        <w:t xml:space="preserve">import </w:t>
+      </w:r>
+      <w:proofErr w:type="spellStart"/>
+      <w:r>
+        <w:t>nltk</w:t>
+      </w:r>
+      <w:proofErr w:type="spellEnd"/>
+    </w:p>
+    <w:p>
+      <w:r>
+        <w:t xml:space="preserve">from </w:t>
+      </w:r>
+      <w:proofErr w:type="spellStart"/>
+      <w:proofErr w:type="gramStart"/>
+      <w:r>
+        <w:t>nltk.corpus</w:t>
+      </w:r>
+      <w:proofErr w:type="spellEnd"/>
+      <w:proofErr w:type="gramEnd"/>
+      <w:r>
+        <w:t xml:space="preserve"> import </w:t>
+      </w:r>
+      <w:proofErr w:type="spellStart"/>
+      <w:r>
+        <w:t>stopwords</w:t>
+      </w:r>
+      <w:proofErr w:type="spellEnd"/>
+    </w:p>
+    <w:p>
+      <w:r>
+        <w:t xml:space="preserve">from </w:t>
+      </w:r>
+      <w:proofErr w:type="spellStart"/>
+      <w:proofErr w:type="gramStart"/>
+      <w:r>
+        <w:t>nltk.tokenize</w:t>
+      </w:r>
+      <w:proofErr w:type="spellEnd"/>
+      <w:proofErr w:type="gramEnd"/>
+      <w:r>
+        <w:t xml:space="preserve"> import </w:t>
+      </w:r>
+      <w:proofErr w:type="spellStart"/>
+      <w:r>
+        <w:t>sent_tokenize</w:t>
+      </w:r>
+      <w:proofErr w:type="spellEnd"/>
+      <w:r>
+        <w:t xml:space="preserve">, </w:t>
+      </w:r>
+      <w:proofErr w:type="spellStart"/>
+      <w:r>
+        <w:t>word_tokenize</w:t>
+      </w:r>
+      <w:proofErr w:type="spellEnd"/>
+    </w:p>
+    <w:p>
+      <w:r>
+        <w:t>from collections import Counter</w:t>
+      </w:r>
+    </w:p>
+    <w:p>
+      <w:r>
+        <w:t xml:space="preserve">from </w:t>
+      </w:r>
+      <w:proofErr w:type="spellStart"/>
+      <w:r>
+        <w:t>wordcloud</w:t>
+      </w:r>
+      <w:proofErr w:type="spellEnd"/>
+      <w:r>
+        <w:t xml:space="preserve"> import </w:t>
+      </w:r>
+      <w:proofErr w:type="spellStart"/>
+      <w:r>
+        <w:t>WordCloud</w:t>
+      </w:r>
+      <w:proofErr w:type="spellEnd"/>
+    </w:p>
+    <w:p>
+      <w:r>
+        <w:t xml:space="preserve">import </w:t>
+      </w:r>
+      <w:proofErr w:type="spellStart"/>
+      <w:proofErr w:type="gramStart"/>
+      <w:r>
+        <w:t>matplotlib.pyplot</w:t>
+      </w:r>
+      <w:proofErr w:type="spellEnd"/>
+      <w:proofErr w:type="gramEnd"/>
+      <w:r>
+        <w:t xml:space="preserve"> as </w:t>
+      </w:r>
+      <w:proofErr w:type="spellStart"/>
+      <w:r>
+        <w:t>plt</w:t>
+      </w:r>
+      <w:proofErr w:type="spellEnd"/>
+    </w:p>
+    <w:p/>
+    <w:p>
+      <w:r>
+        <w:t># 1. Read the dataset</w:t>
+      </w:r>
+    </w:p>
+    <w:p>
+      <w:proofErr w:type="spellStart"/>
+      <w:r>
+        <w:t>df</w:t>
+      </w:r>
+      <w:proofErr w:type="spellEnd"/>
+      <w:r>
+        <w:t xml:space="preserve"> = </w:t>
+      </w:r>
+      <w:proofErr w:type="spellStart"/>
+      <w:proofErr w:type="gramStart"/>
+      <w:r>
+        <w:t>pd.read</w:t>
+      </w:r>
+      <w:proofErr w:type="gramEnd"/>
+      <w:r>
+        <w:t>_</w:t>
+      </w:r>
+      <w:proofErr w:type="gramStart"/>
+      <w:r>
+        <w:t>csv</w:t>
+      </w:r>
+      <w:proofErr w:type="spellEnd"/>
+      <w:r>
+        <w:t>(</w:t>
+      </w:r>
+      <w:proofErr w:type="spellStart"/>
+      <w:proofErr w:type="gramEnd"/>
+      <w:r>
+        <w:rPr>
+          <w:i/>
+          <w:iCs/>
+        </w:rPr>
+        <w:t>r</w:t>
+      </w:r>
+      <w:r>
+        <w:t>"D</w:t>
+      </w:r>
+      <w:proofErr w:type="spellEnd"/>
+      <w:r>
+        <w:t>:\SEM_5\ML\datasets\Text_data\IMDB Dataset.csv")</w:t>
+      </w:r>
+    </w:p>
+    <w:p>
+      <w:r>
+        <w:t xml:space="preserve">reviews = </w:t>
+      </w:r>
+      <w:proofErr w:type="spellStart"/>
+      <w:r>
+        <w:t>df</w:t>
+      </w:r>
+      <w:proofErr w:type="spellEnd"/>
+      <w:r>
+        <w:t>['review']</w:t>
+      </w:r>
+    </w:p>
+    <w:p>
+      <w:r>
+        <w:t xml:space="preserve">text = " </w:t>
+      </w:r>
+      <w:proofErr w:type="gramStart"/>
+      <w:r>
+        <w:t>".join</w:t>
+      </w:r>
+      <w:proofErr w:type="gramEnd"/>
+      <w:r>
+        <w:t>(</w:t>
+      </w:r>
+      <w:proofErr w:type="spellStart"/>
+      <w:proofErr w:type="gramStart"/>
+      <w:r>
+        <w:t>reviews.astype</w:t>
+      </w:r>
+      <w:proofErr w:type="spellEnd"/>
+      <w:proofErr w:type="gramEnd"/>
+      <w:r>
+        <w:t>(</w:t>
+      </w:r>
+      <w:r>
+        <w:rPr>
+          <w:i/>
+          <w:iCs/>
+        </w:rPr>
+        <w:t>str</w:t>
+      </w:r>
+      <w:r>
+        <w:t>))</w:t>
+      </w:r>
+    </w:p>
+    <w:p/>
+    <w:p>
+      <w:r>
+        <w:t># 2. Count the number of sentences</w:t>
+      </w:r>
+    </w:p>
+    <w:p>
+      <w:r>
+        <w:t xml:space="preserve">sentences = </w:t>
+      </w:r>
+      <w:proofErr w:type="spellStart"/>
+      <w:r>
+        <w:t>sent_tokenize</w:t>
+      </w:r>
+      <w:proofErr w:type="spellEnd"/>
+      <w:r>
+        <w:t>(text)</w:t>
+      </w:r>
+    </w:p>
+    <w:p>
+      <w:proofErr w:type="gramStart"/>
+      <w:r>
+        <w:rPr>
+          <w:b/>
+          <w:bCs/>
+        </w:rPr>
+        <w:t>print</w:t>
+      </w:r>
+      <w:r>
+        <w:t>(</w:t>
+      </w:r>
+      <w:proofErr w:type="gramEnd"/>
+      <w:r>
+        <w:t>"\</w:t>
+      </w:r>
+      <w:proofErr w:type="spellStart"/>
+      <w:r>
+        <w:t>nNumber</w:t>
+      </w:r>
+      <w:proofErr w:type="spellEnd"/>
+      <w:r>
+        <w:t xml:space="preserve"> of Sentences:")</w:t>
+      </w:r>
+    </w:p>
+    <w:p>
+      <w:r>
+        <w:rPr>
+          <w:b/>
+          <w:bCs/>
+        </w:rPr>
+        <w:t>print</w:t>
+      </w:r>
+      <w:r>
+        <w:t>(</w:t>
+      </w:r>
+      <w:proofErr w:type="spellStart"/>
+      <w:r>
+        <w:rPr>
+          <w:b/>
+          <w:bCs/>
+        </w:rPr>
+        <w:t>len</w:t>
+      </w:r>
+      <w:proofErr w:type="spellEnd"/>
+      <w:r>
+        <w:t>(sentences))</w:t>
+      </w:r>
+    </w:p>
+    <w:p>
+      <w:r>
+        <w:lastRenderedPageBreak/>
+        <w:t># 3. Count the number of words</w:t>
+      </w:r>
+    </w:p>
+    <w:p>
+      <w:r>
+        <w:t xml:space="preserve">words = </w:t>
+      </w:r>
+      <w:proofErr w:type="spellStart"/>
+      <w:r>
+        <w:t>word_tokenize</w:t>
+      </w:r>
+      <w:proofErr w:type="spellEnd"/>
+      <w:r>
+        <w:t>(text)</w:t>
+      </w:r>
+    </w:p>
+    <w:p>
+      <w:r>
+        <w:t>words = [</w:t>
+      </w:r>
+      <w:proofErr w:type="spellStart"/>
+      <w:proofErr w:type="gramStart"/>
+      <w:r>
+        <w:t>word.lower</w:t>
+      </w:r>
+      <w:proofErr w:type="spellEnd"/>
+      <w:proofErr w:type="gramEnd"/>
+      <w:r>
+        <w:t xml:space="preserve">() for word in words if </w:t>
+      </w:r>
+      <w:proofErr w:type="spellStart"/>
+      <w:proofErr w:type="gramStart"/>
+      <w:r>
+        <w:t>word.isalpha</w:t>
+      </w:r>
+      <w:proofErr w:type="spellEnd"/>
+      <w:proofErr w:type="gramEnd"/>
+      <w:r>
+        <w:t>()]</w:t>
+      </w:r>
+    </w:p>
+    <w:p>
+      <w:proofErr w:type="gramStart"/>
+      <w:r>
+        <w:rPr>
+          <w:b/>
+          <w:bCs/>
+        </w:rPr>
+        <w:t>print</w:t>
+      </w:r>
+      <w:r>
+        <w:t>(</w:t>
+      </w:r>
+      <w:proofErr w:type="gramEnd"/>
+      <w:r>
+        <w:t>"\</w:t>
+      </w:r>
+      <w:proofErr w:type="spellStart"/>
+      <w:r>
+        <w:t>nNumber</w:t>
+      </w:r>
+      <w:proofErr w:type="spellEnd"/>
+      <w:r>
+        <w:t xml:space="preserve"> of Words:")</w:t>
+      </w:r>
+    </w:p>
+    <w:p>
+      <w:r>
+        <w:rPr>
+          <w:b/>
+          <w:bCs/>
+        </w:rPr>
+        <w:t>print</w:t>
+      </w:r>
+      <w:r>
+        <w:t>(</w:t>
+      </w:r>
+      <w:proofErr w:type="spellStart"/>
+      <w:r>
+        <w:rPr>
+          <w:b/>
+          <w:bCs/>
+        </w:rPr>
+        <w:t>len</w:t>
+      </w:r>
+      <w:proofErr w:type="spellEnd"/>
+      <w:r>
+        <w:t>(words))</w:t>
+      </w:r>
+    </w:p>
+    <w:p/>
+    <w:p>
+      <w:r>
+        <w:t># 4. Find the 10 most frequent words</w:t>
+      </w:r>
+    </w:p>
+    <w:p>
+      <w:proofErr w:type="spellStart"/>
+      <w:r>
+        <w:t>word_freq</w:t>
+      </w:r>
+      <w:proofErr w:type="spellEnd"/>
+      <w:r>
+        <w:t xml:space="preserve"> = Counter(words)</w:t>
+      </w:r>
+    </w:p>
+    <w:p>
+      <w:proofErr w:type="gramStart"/>
+      <w:r>
+        <w:rPr>
+          <w:b/>
+          <w:bCs/>
+        </w:rPr>
+        <w:t>print</w:t>
+      </w:r>
+      <w:r>
+        <w:t>(</w:t>
+      </w:r>
+      <w:proofErr w:type="gramEnd"/>
+      <w:r>
+        <w:t>"\</w:t>
+      </w:r>
+      <w:proofErr w:type="spellStart"/>
+      <w:r>
+        <w:t>nTop</w:t>
+      </w:r>
+      <w:proofErr w:type="spellEnd"/>
+      <w:r>
+        <w:t xml:space="preserve"> 10 Most Frequent Words:")</w:t>
+      </w:r>
+    </w:p>
+    <w:p>
+      <w:r>
+        <w:t xml:space="preserve">for word, count in </w:t>
+      </w:r>
+      <w:proofErr w:type="spellStart"/>
+      <w:r>
+        <w:t>word_</w:t>
+      </w:r>
+      <w:proofErr w:type="gramStart"/>
+      <w:r>
+        <w:t>freq.most</w:t>
+      </w:r>
+      <w:proofErr w:type="gramEnd"/>
+      <w:r>
+        <w:t>_</w:t>
+      </w:r>
+      <w:proofErr w:type="gramStart"/>
+      <w:r>
+        <w:t>common</w:t>
+      </w:r>
+      <w:proofErr w:type="spellEnd"/>
+      <w:r>
+        <w:t>(</w:t>
+      </w:r>
+      <w:proofErr w:type="gramEnd"/>
+      <w:r>
+        <w:t>10):</w:t>
+      </w:r>
+    </w:p>
+    <w:p>
+      <w:r>
+        <w:t xml:space="preserve">    </w:t>
+      </w:r>
+      <w:r>
+        <w:rPr>
+          <w:b/>
+          <w:bCs/>
+        </w:rPr>
+        <w:t>print</w:t>
+      </w:r>
+      <w:r>
+        <w:t>(</w:t>
+      </w:r>
+      <w:r>
+        <w:rPr>
+          <w:i/>
+          <w:iCs/>
+        </w:rPr>
+        <w:t>f</w:t>
+      </w:r>
+      <w:r>
+        <w:t>"{word</w:t>
+      </w:r>
+      <w:proofErr w:type="gramStart"/>
+      <w:r>
+        <w:t>} :</w:t>
+      </w:r>
+      <w:proofErr w:type="gramEnd"/>
+      <w:r>
+        <w:t xml:space="preserve"> {count}")</w:t>
+      </w:r>
+    </w:p>
+    <w:p/>
+    <w:p>
+      <w:r>
+        <w:t># 5. Remove stop words and compare results</w:t>
+      </w:r>
+    </w:p>
+    <w:p>
+      <w:proofErr w:type="spellStart"/>
+      <w:r>
+        <w:t>stop_words</w:t>
+      </w:r>
+      <w:proofErr w:type="spellEnd"/>
+      <w:r>
+        <w:t xml:space="preserve"> = </w:t>
+      </w:r>
+      <w:r>
+        <w:rPr>
+          <w:i/>
+          <w:iCs/>
+        </w:rPr>
+        <w:t>set</w:t>
+      </w:r>
+      <w:r>
+        <w:t>(</w:t>
+      </w:r>
+      <w:proofErr w:type="spellStart"/>
+      <w:proofErr w:type="gramStart"/>
+      <w:r>
+        <w:t>stopwords.words</w:t>
+      </w:r>
+      <w:proofErr w:type="spellEnd"/>
+      <w:proofErr w:type="gramEnd"/>
+      <w:r>
+        <w:t>('</w:t>
+      </w:r>
+      <w:proofErr w:type="spellStart"/>
+      <w:r>
+        <w:t>english</w:t>
+      </w:r>
+      <w:proofErr w:type="spellEnd"/>
+      <w:r>
+        <w:t>'))</w:t>
+      </w:r>
+    </w:p>
+    <w:p>
+      <w:proofErr w:type="spellStart"/>
+      <w:r>
+        <w:t>filtered_words</w:t>
+      </w:r>
+      <w:proofErr w:type="spellEnd"/>
+      <w:r>
+        <w:t xml:space="preserve"> = [word for word in words</w:t>
+      </w:r>
+    </w:p>
+    <w:p>
+      <w:r>
+        <w:t xml:space="preserve">                  if word not in </w:t>
+      </w:r>
+      <w:proofErr w:type="spellStart"/>
+      <w:r>
+        <w:t>stop_words</w:t>
+      </w:r>
+      <w:proofErr w:type="spellEnd"/>
+      <w:r>
+        <w:t>]</w:t>
+      </w:r>
+    </w:p>
+    <w:p>
+      <w:proofErr w:type="spellStart"/>
+      <w:r>
+        <w:t>filtered_freq</w:t>
+      </w:r>
+      <w:proofErr w:type="spellEnd"/>
+      <w:r>
+        <w:t xml:space="preserve"> = Counter(</w:t>
+      </w:r>
+      <w:proofErr w:type="spellStart"/>
+      <w:r>
+        <w:t>filtered_words</w:t>
+      </w:r>
+      <w:proofErr w:type="spellEnd"/>
+      <w:r>
+        <w:t>)</w:t>
+      </w:r>
+    </w:p>
+    <w:p>
+      <w:proofErr w:type="gramStart"/>
+      <w:r>
+        <w:rPr>
+          <w:b/>
+          <w:bCs/>
+        </w:rPr>
+        <w:t>print</w:t>
+      </w:r>
+      <w:r>
+        <w:t>(</w:t>
+      </w:r>
+      <w:proofErr w:type="gramEnd"/>
+      <w:r>
+        <w:t>"\</w:t>
+      </w:r>
+      <w:proofErr w:type="spellStart"/>
+      <w:r>
+        <w:t>nTop</w:t>
+      </w:r>
+      <w:proofErr w:type="spellEnd"/>
+      <w:r>
+        <w:t xml:space="preserve"> 10 Words After Removing Stop Words:")</w:t>
+      </w:r>
+    </w:p>
+    <w:p>
+      <w:r>
+        <w:t xml:space="preserve">for word, count in </w:t>
+      </w:r>
+      <w:proofErr w:type="spellStart"/>
+      <w:r>
+        <w:t>filtered_</w:t>
+      </w:r>
+      <w:proofErr w:type="gramStart"/>
+      <w:r>
+        <w:t>freq.most</w:t>
+      </w:r>
+      <w:proofErr w:type="gramEnd"/>
+      <w:r>
+        <w:t>_</w:t>
+      </w:r>
+      <w:proofErr w:type="gramStart"/>
+      <w:r>
+        <w:t>common</w:t>
+      </w:r>
+      <w:proofErr w:type="spellEnd"/>
+      <w:r>
+        <w:t>(</w:t>
+      </w:r>
+      <w:proofErr w:type="gramEnd"/>
+      <w:r>
+        <w:t>10):</w:t>
+      </w:r>
+    </w:p>
+    <w:p>
+      <w:r>
+        <w:t xml:space="preserve">    </w:t>
+      </w:r>
+      <w:r>
+        <w:rPr>
+          <w:b/>
+          <w:bCs/>
+        </w:rPr>
+        <w:t>print</w:t>
+      </w:r>
+      <w:r>
+        <w:t>(</w:t>
+      </w:r>
+      <w:r>
+        <w:rPr>
+          <w:i/>
+          <w:iCs/>
+        </w:rPr>
+        <w:t>f</w:t>
+      </w:r>
+      <w:r>
+        <w:t>"{word</w:t>
+      </w:r>
+      <w:proofErr w:type="gramStart"/>
+      <w:r>
+        <w:t>} :</w:t>
+      </w:r>
+      <w:proofErr w:type="gramEnd"/>
+      <w:r>
+        <w:t xml:space="preserve"> {count}")</w:t>
+      </w:r>
+    </w:p>
+    <w:p/>
+    <w:p>
+      <w:r>
+        <w:t># 6. Calculate Vocabulary Size</w:t>
+      </w:r>
+    </w:p>
+    <w:p>
+      <w:r>
+        <w:t xml:space="preserve">vocabulary = </w:t>
+      </w:r>
+      <w:r>
+        <w:rPr>
+          <w:i/>
+          <w:iCs/>
+        </w:rPr>
+        <w:t>set</w:t>
+      </w:r>
+      <w:r>
+        <w:t>(</w:t>
+      </w:r>
+      <w:proofErr w:type="spellStart"/>
+      <w:r>
+        <w:t>filtered_words</w:t>
+      </w:r>
+      <w:proofErr w:type="spellEnd"/>
+      <w:r>
+        <w:t>)</w:t>
+      </w:r>
+    </w:p>
+    <w:p>
+      <w:proofErr w:type="gramStart"/>
+      <w:r>
+        <w:rPr>
+          <w:b/>
+          <w:bCs/>
+        </w:rPr>
+        <w:t>print</w:t>
+      </w:r>
+      <w:r>
+        <w:t>(</w:t>
+      </w:r>
+      <w:proofErr w:type="gramEnd"/>
+      <w:r>
+        <w:t>"\</w:t>
+      </w:r>
+      <w:proofErr w:type="spellStart"/>
+      <w:r>
+        <w:t>nVocabulary</w:t>
+      </w:r>
+      <w:proofErr w:type="spellEnd"/>
+      <w:r>
+        <w:t xml:space="preserve"> Size:")</w:t>
+      </w:r>
+    </w:p>
+    <w:p>
+      <w:r>
+        <w:rPr>
+          <w:b/>
+          <w:bCs/>
+        </w:rPr>
+        <w:t>print</w:t>
+      </w:r>
+      <w:r>
+        <w:t>(</w:t>
+      </w:r>
+      <w:proofErr w:type="spellStart"/>
+      <w:r>
+        <w:rPr>
+          <w:b/>
+          <w:bCs/>
+        </w:rPr>
+        <w:t>len</w:t>
+      </w:r>
+      <w:proofErr w:type="spellEnd"/>
+      <w:r>
+        <w:t>(vocabulary))</w:t>
+      </w:r>
+    </w:p>
+    <w:p/>
+    <w:p>
+      <w:r>
+        <w:t># 7. Find Average Sentence Length</w:t>
+      </w:r>
+    </w:p>
+    <w:p>
+      <w:proofErr w:type="spellStart"/>
+      <w:r>
+        <w:t>total_words</w:t>
+      </w:r>
+      <w:proofErr w:type="spellEnd"/>
+      <w:r>
+        <w:t xml:space="preserve"> = </w:t>
+      </w:r>
+      <w:proofErr w:type="spellStart"/>
+      <w:r>
+        <w:rPr>
+          <w:b/>
+          <w:bCs/>
+        </w:rPr>
+        <w:t>len</w:t>
+      </w:r>
+      <w:proofErr w:type="spellEnd"/>
+      <w:r>
+        <w:t>(words)</w:t>
+      </w:r>
+    </w:p>
+    <w:p>
+      <w:proofErr w:type="spellStart"/>
+      <w:r>
+        <w:t>total_sentences</w:t>
+      </w:r>
+      <w:proofErr w:type="spellEnd"/>
+      <w:r>
+        <w:t xml:space="preserve"> = </w:t>
+      </w:r>
+      <w:proofErr w:type="spellStart"/>
+      <w:r>
+        <w:rPr>
+          <w:b/>
+          <w:bCs/>
+        </w:rPr>
+        <w:t>len</w:t>
+      </w:r>
+      <w:proofErr w:type="spellEnd"/>
+      <w:r>
+        <w:t>(sentences)</w:t>
+      </w:r>
+    </w:p>
+    <w:p>
+      <w:proofErr w:type="spellStart"/>
+      <w:r>
+        <w:t>avg_sentence_length</w:t>
+      </w:r>
+      <w:proofErr w:type="spellEnd"/>
+      <w:r>
+        <w:t xml:space="preserve"> = </w:t>
+      </w:r>
+      <w:proofErr w:type="spellStart"/>
+      <w:r>
+        <w:t>total_words</w:t>
+      </w:r>
+      <w:proofErr w:type="spellEnd"/>
+      <w:r>
+        <w:t xml:space="preserve"> / </w:t>
+      </w:r>
+      <w:proofErr w:type="spellStart"/>
+      <w:r>
+        <w:t>total_sentences</w:t>
+      </w:r>
+      <w:proofErr w:type="spellEnd"/>
+    </w:p>
+    <w:p>
+      <w:proofErr w:type="gramStart"/>
+      <w:r>
+        <w:rPr>
+          <w:b/>
+          <w:bCs/>
+        </w:rPr>
+        <w:t>print</w:t>
+      </w:r>
+      <w:r>
+        <w:t>(</w:t>
+      </w:r>
+      <w:proofErr w:type="gramEnd"/>
+      <w:r>
+        <w:t>"\</w:t>
+      </w:r>
+      <w:proofErr w:type="spellStart"/>
+      <w:r>
+        <w:t>nAverage</w:t>
+      </w:r>
+      <w:proofErr w:type="spellEnd"/>
+      <w:r>
+        <w:t xml:space="preserve"> Sentence Length:")</w:t>
+      </w:r>
+    </w:p>
+    <w:p>
+      <w:proofErr w:type="gramStart"/>
+      <w:r>
+        <w:rPr>
+          <w:b/>
+          <w:bCs/>
+        </w:rPr>
+        <w:t>print</w:t>
+      </w:r>
+      <w:r>
+        <w:t>(</w:t>
+      </w:r>
+      <w:r>
+        <w:rPr>
+          <w:b/>
+          <w:bCs/>
+        </w:rPr>
+        <w:t>round</w:t>
+      </w:r>
+      <w:r>
+        <w:t>(</w:t>
+      </w:r>
+      <w:proofErr w:type="spellStart"/>
+      <w:proofErr w:type="gramEnd"/>
+      <w:r>
+        <w:t>avg_sentence_length</w:t>
+      </w:r>
+      <w:proofErr w:type="spellEnd"/>
+      <w:r>
+        <w:t>, 2), "words")</w:t>
+      </w:r>
+    </w:p>
+    <w:p/>
+    <w:p/>
+    <w:p>
+      <w:r>
+        <w:lastRenderedPageBreak/>
+        <w:t># 8. Generate Word Cloud</w:t>
+      </w:r>
+    </w:p>
+    <w:p>
+      <w:proofErr w:type="spellStart"/>
+      <w:r>
+        <w:t>wordcloud</w:t>
+      </w:r>
+      <w:proofErr w:type="spellEnd"/>
+      <w:r>
+        <w:t xml:space="preserve"> = </w:t>
+      </w:r>
+      <w:proofErr w:type="spellStart"/>
+      <w:proofErr w:type="gramStart"/>
+      <w:r>
+        <w:t>WordCloud</w:t>
+      </w:r>
+      <w:proofErr w:type="spellEnd"/>
+      <w:r>
+        <w:t>(</w:t>
+      </w:r>
+      <w:proofErr w:type="gramEnd"/>
+    </w:p>
+    <w:p>
+      <w:r>
+        <w:t xml:space="preserve">    </w:t>
+      </w:r>
+      <w:r>
+        <w:rPr>
+          <w:i/>
+          <w:iCs/>
+        </w:rPr>
+        <w:t>width</w:t>
+      </w:r>
+      <w:r>
+        <w:t>=1000,</w:t>
+      </w:r>
+    </w:p>
+    <w:p>
+      <w:r>
+        <w:t xml:space="preserve">    </w:t>
+      </w:r>
+      <w:r>
+        <w:rPr>
+          <w:i/>
+          <w:iCs/>
+        </w:rPr>
+        <w:t>height</w:t>
+      </w:r>
+      <w:r>
+        <w:t>=500,</w:t>
+      </w:r>
+    </w:p>
+    <w:p>
+      <w:r>
+        <w:t xml:space="preserve">    </w:t>
+      </w:r>
+      <w:proofErr w:type="spellStart"/>
+      <w:r>
+        <w:rPr>
+          <w:i/>
+          <w:iCs/>
+        </w:rPr>
+        <w:t>background_color</w:t>
+      </w:r>
+      <w:proofErr w:type="spellEnd"/>
+      <w:r>
+        <w:t>='white'</w:t>
+      </w:r>
+    </w:p>
+    <w:p>
+      <w:proofErr w:type="gramStart"/>
+      <w:r>
+        <w:t>).generate</w:t>
+      </w:r>
+      <w:proofErr w:type="gramEnd"/>
+      <w:r>
+        <w:t xml:space="preserve">(" </w:t>
+      </w:r>
+      <w:proofErr w:type="gramStart"/>
+      <w:r>
+        <w:t>".join</w:t>
+      </w:r>
+      <w:proofErr w:type="gramEnd"/>
+      <w:r>
+        <w:t>(</w:t>
+      </w:r>
+      <w:proofErr w:type="spellStart"/>
+      <w:r>
+        <w:t>filtered_words</w:t>
+      </w:r>
+      <w:proofErr w:type="spellEnd"/>
+      <w:r>
+        <w:t>))</w:t>
+      </w:r>
+    </w:p>
+    <w:p>
+      <w:proofErr w:type="spellStart"/>
+      <w:proofErr w:type="gramStart"/>
+      <w:r>
+        <w:t>plt.figure</w:t>
+      </w:r>
+      <w:proofErr w:type="spellEnd"/>
+      <w:proofErr w:type="gramEnd"/>
+      <w:r>
+        <w:t>(</w:t>
+      </w:r>
+      <w:proofErr w:type="spellStart"/>
+      <w:r>
+        <w:rPr>
+          <w:i/>
+          <w:iCs/>
+        </w:rPr>
+        <w:t>figsize</w:t>
+      </w:r>
+      <w:proofErr w:type="spellEnd"/>
+      <w:proofErr w:type="gramStart"/>
+      <w:r>
+        <w:t>=(</w:t>
+      </w:r>
+      <w:proofErr w:type="gramEnd"/>
+      <w:r>
+        <w:t>12, 6))</w:t>
+      </w:r>
+    </w:p>
+    <w:p>
+      <w:proofErr w:type="spellStart"/>
+      <w:proofErr w:type="gramStart"/>
+      <w:r>
+        <w:t>plt.imshow</w:t>
+      </w:r>
+      <w:proofErr w:type="spellEnd"/>
+      <w:proofErr w:type="gramEnd"/>
+      <w:r>
+        <w:t>(</w:t>
+      </w:r>
+      <w:proofErr w:type="spellStart"/>
+      <w:r>
+        <w:t>wordcloud</w:t>
+      </w:r>
+      <w:proofErr w:type="spellEnd"/>
+      <w:r>
+        <w:t xml:space="preserve">, </w:t>
+      </w:r>
+      <w:r>
+        <w:rPr>
+          <w:i/>
+          <w:iCs/>
+        </w:rPr>
+        <w:t>interpolation</w:t>
+      </w:r>
+      <w:r>
+        <w:t>='bilinear')</w:t>
+      </w:r>
+    </w:p>
+    <w:p>
+      <w:proofErr w:type="spellStart"/>
+      <w:proofErr w:type="gramStart"/>
+      <w:r>
+        <w:t>plt.axis</w:t>
+      </w:r>
+      <w:proofErr w:type="spellEnd"/>
+      <w:proofErr w:type="gramEnd"/>
+      <w:r>
+        <w:t>("off")</w:t>
+      </w:r>
+    </w:p>
+    <w:p>
+      <w:proofErr w:type="spellStart"/>
+      <w:proofErr w:type="gramStart"/>
+      <w:r>
+        <w:t>plt.title</w:t>
+      </w:r>
+      <w:proofErr w:type="spellEnd"/>
+      <w:proofErr w:type="gramEnd"/>
+      <w:r>
+        <w:t>("Word Cloud of IMDb Reviews")</w:t>
+      </w:r>
+    </w:p>
+    <w:p>
+      <w:proofErr w:type="spellStart"/>
+      <w:proofErr w:type="gramStart"/>
+      <w:r>
+        <w:t>plt.show</w:t>
+      </w:r>
+      <w:proofErr w:type="spellEnd"/>
+      <w:proofErr w:type="gramEnd"/>
+      <w:r>
+        <w:t>()</w:t>
+      </w:r>
+    </w:p>
+    <w:p/>
+    <w:p>
+      <w:pPr>
+        <w:rPr>
+          <w:b/>
+          <w:bCs/>
+          <w:sz w:val="24"/>
+          <w:szCs w:val="24"/>
+        </w:rPr>
+      </w:pPr>
+      <w:r>
+        <w:rPr>
+          <w:b/>
+          <w:bCs/>
+          <w:sz w:val="24"/>
+          <w:szCs w:val="24"/>
+        </w:rPr>
+        <w:t>OUTPUT:</w:t>
+      </w:r>
+    </w:p>
+    <w:p>
+      <w:r>
+        <w:t>2.</w:t>
+      </w:r>
+    </w:p>
+    <w:p>
+      <w:r>
+        <w:drawing>
+          <wp:inline distT="0" distB="0" distL="0" distR="0" wp14:anchorId="5EE41E8A" wp14:editId="70746F18">
+            <wp:extent cx="1581231" cy="387370"/>
+            <wp:effectExtent l="0" t="0" r="0" b="0"/>
+            <wp:docPr id="1982945041" name="Picture 1"/>
+            <wp:cNvGraphicFramePr>
+              <a:graphicFrameLocks xmlns:a="http://schemas.openxmlformats.org/drawingml/2006/main" noChangeAspect="1"/>
+            </wp:cNvGraphicFramePr>
+            <a:graphic xmlns:a="http://schemas.openxmlformats.org/drawingml/2006/main">
+              <a:graphicData uri="http://schemas.openxmlformats.org/drawingml/2006/picture">
+                <pic:pic xmlns:pic="http://schemas.openxmlformats.org/drawingml/2006/picture">
+                  <pic:nvPicPr>
+                    <pic:cNvPr id="1982945041" name=""/>
+                    <pic:cNvPicPr/>
+                  </pic:nvPicPr>
+                  <pic:blipFill>
+                    <a:blip r:embed="rId15"/>
+                    <a:stretch>
+                      <a:fillRect/>
+                    </a:stretch>
+                  </pic:blipFill>
+                  <pic:spPr>
+                    <a:xfrm>
+                      <a:off x="0" y="0"/>
+                      <a:ext cx="1581231" cy="387370"/>
+                    </a:xfrm>
+                    <a:prstGeom prst="rect">
+                      <a:avLst/>
+                    </a:prstGeom>
+                  </pic:spPr>
+                </pic:pic>
+              </a:graphicData>
+            </a:graphic>
+          </wp:inline>
+        </w:drawing>
+      </w:r>
+    </w:p>
+    <w:p/>
+    <w:p>
+      <w:r>
+        <w:t>3.</w:t>
+      </w:r>
+    </w:p>
+    <w:p>
+      <w:r>
+        <w:drawing>
+          <wp:inline distT="0" distB="0" distL="0" distR="0" wp14:anchorId="6657FB03" wp14:editId="5845848B">
+            <wp:extent cx="1358970" cy="368319"/>
+            <wp:effectExtent l="0" t="0" r="0" b="0"/>
+            <wp:docPr id="2013167749" name="Picture 1"/>
+            <wp:cNvGraphicFramePr>
+              <a:graphicFrameLocks xmlns:a="http://schemas.openxmlformats.org/drawingml/2006/main" noChangeAspect="1"/>
+            </wp:cNvGraphicFramePr>
+            <a:graphic xmlns:a="http://schemas.openxmlformats.org/drawingml/2006/main">
+              <a:graphicData uri="http://schemas.openxmlformats.org/drawingml/2006/picture">
+                <pic:pic xmlns:pic="http://schemas.openxmlformats.org/drawingml/2006/picture">
+                  <pic:nvPicPr>
+                    <pic:cNvPr id="2013167749" name=""/>
+                    <pic:cNvPicPr/>
+                  </pic:nvPicPr>
+                  <pic:blipFill>
+                    <a:blip r:embed="rId16"/>
+                    <a:stretch>
+                      <a:fillRect/>
+                    </a:stretch>
+                  </pic:blipFill>
+                  <pic:spPr>
+                    <a:xfrm>
+                      <a:off x="0" y="0"/>
+                      <a:ext cx="1358970" cy="368319"/>
+                    </a:xfrm>
+                    <a:prstGeom prst="rect">
+                      <a:avLst/>
+                    </a:prstGeom>
+                  </pic:spPr>
+                </pic:pic>
+              </a:graphicData>
+            </a:graphic>
+          </wp:inline>
+        </w:drawing>
+      </w:r>
+    </w:p>
+    <w:p/>
+    <w:p>
+      <w:r>
+        <w:t>4.</w:t>
+      </w:r>
+    </w:p>
+    <w:p>
+      <w:r>
+        <w:drawing>
+          <wp:inline distT="0" distB="0" distL="0" distR="0" wp14:anchorId="5927053C" wp14:editId="05FD2751">
+            <wp:extent cx="1883121" cy="1684282"/>
+            <wp:effectExtent l="0" t="0" r="3175" b="0"/>
+            <wp:docPr id="1489319936" name="Picture 1"/>
+            <wp:cNvGraphicFramePr>
+              <a:graphicFrameLocks xmlns:a="http://schemas.openxmlformats.org/drawingml/2006/main" noChangeAspect="1"/>
+            </wp:cNvGraphicFramePr>
+            <a:graphic xmlns:a="http://schemas.openxmlformats.org/drawingml/2006/main">
+              <a:graphicData uri="http://schemas.openxmlformats.org/drawingml/2006/picture">
+                <pic:pic xmlns:pic="http://schemas.openxmlformats.org/drawingml/2006/picture">
+                  <pic:nvPicPr>
+                    <pic:cNvPr id="1489319936" name=""/>
+                    <pic:cNvPicPr/>
+                  </pic:nvPicPr>
+                  <pic:blipFill>
+                    <a:blip r:embed="rId17"/>
+                    <a:stretch>
+                      <a:fillRect/>
+                    </a:stretch>
+                  </pic:blipFill>
+                  <pic:spPr>
+                    <a:xfrm>
+                      <a:off x="0" y="0"/>
+                      <a:ext cx="1886451" cy="1687260"/>
+                    </a:xfrm>
+                    <a:prstGeom prst="rect">
+                      <a:avLst/>
+                    </a:prstGeom>
+                  </pic:spPr>
+                </pic:pic>
+              </a:graphicData>
+            </a:graphic>
+          </wp:inline>
+        </w:drawing>
+      </w:r>
+    </w:p>
+    <w:p/>
+    <w:p/>
+    <w:p/>
+    <w:p/>
+    <w:p/>
+    <w:p/>
+    <w:p>
+      <w:r>
+        <w:lastRenderedPageBreak/>
+        <w:t>5.</w:t>
+      </w:r>
+    </w:p>
+    <w:p>
+      <w:r>
+        <w:drawing>
+          <wp:inline distT="0" distB="0" distL="0" distR="0" wp14:anchorId="2FADFA08" wp14:editId="0ED6D9A5">
+            <wp:extent cx="2625505" cy="1717348"/>
+            <wp:effectExtent l="0" t="0" r="3810" b="0"/>
+            <wp:docPr id="1414911416" name="Picture 1"/>
+            <wp:cNvGraphicFramePr>
+              <a:graphicFrameLocks xmlns:a="http://schemas.openxmlformats.org/drawingml/2006/main" noChangeAspect="1"/>
+            </wp:cNvGraphicFramePr>
+            <a:graphic xmlns:a="http://schemas.openxmlformats.org/drawingml/2006/main">
+              <a:graphicData uri="http://schemas.openxmlformats.org/drawingml/2006/picture">
+                <pic:pic xmlns:pic="http://schemas.openxmlformats.org/drawingml/2006/picture">
+                  <pic:nvPicPr>
+                    <pic:cNvPr id="1414911416" name=""/>
+                    <pic:cNvPicPr/>
+                  </pic:nvPicPr>
+                  <pic:blipFill>
+                    <a:blip r:embed="rId18"/>
+                    <a:stretch>
+                      <a:fillRect/>
+                    </a:stretch>
+                  </pic:blipFill>
+                  <pic:spPr>
+                    <a:xfrm>
+                      <a:off x="0" y="0"/>
+                      <a:ext cx="2632400" cy="1721858"/>
+                    </a:xfrm>
+                    <a:prstGeom prst="rect">
+                      <a:avLst/>
+                    </a:prstGeom>
+                  </pic:spPr>
+                </pic:pic>
+              </a:graphicData>
+            </a:graphic>
+          </wp:inline>
+        </w:drawing>
+      </w:r>
+    </w:p>
+    <w:p/>
+    <w:p>
+      <w:r>
+        <w:t>6.</w:t>
+      </w:r>
+    </w:p>
+    <w:p>
+      <w:r>
+        <w:drawing>
+          <wp:inline distT="0" distB="0" distL="0" distR="0" wp14:anchorId="0C9F80FB" wp14:editId="5E23DD79">
+            <wp:extent cx="1638384" cy="361969"/>
+            <wp:effectExtent l="0" t="0" r="0" b="0"/>
+            <wp:docPr id="1023074785" name="Picture 1"/>
+            <wp:cNvGraphicFramePr>
+              <a:graphicFrameLocks xmlns:a="http://schemas.openxmlformats.org/drawingml/2006/main" noChangeAspect="1"/>
+            </wp:cNvGraphicFramePr>
+            <a:graphic xmlns:a="http://schemas.openxmlformats.org/drawingml/2006/main">
+              <a:graphicData uri="http://schemas.openxmlformats.org/drawingml/2006/picture">
+                <pic:pic xmlns:pic="http://schemas.openxmlformats.org/drawingml/2006/picture">
+                  <pic:nvPicPr>
+                    <pic:cNvPr id="1023074785" name=""/>
+                    <pic:cNvPicPr/>
+                  </pic:nvPicPr>
+                  <pic:blipFill>
+                    <a:blip r:embed="rId19"/>
+                    <a:stretch>
+                      <a:fillRect/>
+                    </a:stretch>
+                  </pic:blipFill>
+                  <pic:spPr>
+                    <a:xfrm>
+                      <a:off x="0" y="0"/>
+                      <a:ext cx="1638384" cy="361969"/>
+                    </a:xfrm>
+                    <a:prstGeom prst="rect">
+                      <a:avLst/>
+                    </a:prstGeom>
+                  </pic:spPr>
+                </pic:pic>
+              </a:graphicData>
+            </a:graphic>
+          </wp:inline>
+        </w:drawing>
+      </w:r>
+    </w:p>
+    <w:p/>
+    <w:p>
+      <w:r>
+        <w:t>7.</w:t>
+      </w:r>
+    </w:p>
+    <w:p>
+      <w:r>
+        <w:drawing>
+          <wp:inline distT="0" distB="0" distL="0" distR="0" wp14:anchorId="6243CABF" wp14:editId="5DC5F167">
+            <wp:extent cx="1892397" cy="368319"/>
+            <wp:effectExtent l="0" t="0" r="0" b="0"/>
+            <wp:docPr id="1792246286" name="Picture 1"/>
+            <wp:cNvGraphicFramePr>
+              <a:graphicFrameLocks xmlns:a="http://schemas.openxmlformats.org/drawingml/2006/main" noChangeAspect="1"/>
+            </wp:cNvGraphicFramePr>
+            <a:graphic xmlns:a="http://schemas.openxmlformats.org/drawingml/2006/main">
+              <a:graphicData uri="http://schemas.openxmlformats.org/drawingml/2006/picture">
+                <pic:pic xmlns:pic="http://schemas.openxmlformats.org/drawingml/2006/picture">
+                  <pic:nvPicPr>
+                    <pic:cNvPr id="1792246286" name=""/>
+                    <pic:cNvPicPr/>
+                  </pic:nvPicPr>
+                  <pic:blipFill>
+                    <a:blip r:embed="rId20"/>
+                    <a:stretch>
+                      <a:fillRect/>
+                    </a:stretch>
+                  </pic:blipFill>
+                  <pic:spPr>
+                    <a:xfrm>
+                      <a:off x="0" y="0"/>
+                      <a:ext cx="1892397" cy="368319"/>
+                    </a:xfrm>
+                    <a:prstGeom prst="rect">
+                      <a:avLst/>
+                    </a:prstGeom>
+                  </pic:spPr>
+                </pic:pic>
+              </a:graphicData>
+            </a:graphic>
+          </wp:inline>
+        </w:drawing>
+      </w:r>
+    </w:p>
+    <w:p/>
+    <w:p>
+      <w:r>
+        <w:t>8.</w:t>
+      </w:r>
+      <w:r>
+        <w:drawing>
+          <wp:inline distT="0" distB="0" distL="0" distR="0" wp14:anchorId="2D5890D1" wp14:editId="09657990">
+            <wp:extent cx="6645910" cy="3695065"/>
+            <wp:effectExtent l="0" t="0" r="2540" b="635"/>
+            <wp:docPr id="552523722" name="Picture 1"/>
+            <wp:cNvGraphicFramePr>
+              <a:graphicFrameLocks xmlns:a="http://schemas.openxmlformats.org/drawingml/2006/main" noChangeAspect="1"/>
+            </wp:cNvGraphicFramePr>
+            <a:graphic xmlns:a="http://schemas.openxmlformats.org/drawingml/2006/main">
+              <a:graphicData uri="http://schemas.openxmlformats.org/drawingml/2006/picture">
+                <pic:pic xmlns:pic="http://schemas.openxmlformats.org/drawingml/2006/picture">
+                  <pic:nvPicPr>
+                    <pic:cNvPr id="552523722" name=""/>
+                    <pic:cNvPicPr/>
+                  </pic:nvPicPr>
+                  <pic:blipFill>
+                    <a:blip r:embed="rId21"/>
+                    <a:stretch>
+                      <a:fillRect/>
+                    </a:stretch>
+                  </pic:blipFill>
+                  <pic:spPr>
+                    <a:xfrm>
+                      <a:off x="0" y="0"/>
+                      <a:ext cx="6645910" cy="3695065"/>
+                    </a:xfrm>
+                    <a:prstGeom prst="rect">
+                      <a:avLst/>
+                    </a:prstGeom>
+                  </pic:spPr>
+                </pic:pic>
+              </a:graphicData>
+            </a:graphic>
+          </wp:inline>
+        </w:drawing>
+      </w:r>
+    </w:p>
+    <w:p/>
+    <w:p/>
+    <w:p/>
+    <w:p/>
+    <w:p>
+      <w:pPr>
+        <w:rPr>
+          <w:b/>
+          <w:bCs/>
+          <w:sz w:val="24"/>
+          <w:szCs w:val="24"/>
+        </w:rPr>
+      </w:pPr>
+      <w:r>
+        <w:rPr>
+          <w:b/>
+          <w:bCs/>
+          <w:sz w:val="24"/>
+          <w:szCs w:val="24"/>
+        </w:rPr>
+        <w:lastRenderedPageBreak/>
+        <w:t>PART C – IMAGE DATA</w:t>
+      </w:r>
+    </w:p>
+    <w:p>
+      <w:r>
+        <w:t>Using the image dataset:</w:t>
+      </w:r>
+    </w:p>
+    <w:p>
+      <w:r>
+        <w:t>1. Load an image.</w:t>
+      </w:r>
+    </w:p>
+    <w:p>
+      <w:r>
+        <w:t>2. Display the image.</w:t>
+      </w:r>
+    </w:p>
+    <w:p>
+      <w:r>
+        <w:t>3. Determine image dimensions.</w:t>
+      </w:r>
+    </w:p>
+    <w:p>
+      <w:r>
+        <w:t>4. Determine whether it is grayscale or RGB. Perform conversions</w:t>
+      </w:r>
+    </w:p>
+    <w:p>
+      <w:r>
+        <w:t>5. Calculate the total number of pixels.</w:t>
+      </w:r>
+    </w:p>
+    <w:p/>
+    <w:p>
+      <w:pPr>
+        <w:rPr>
+          <w:b/>
+          <w:bCs/>
+          <w:sz w:val="24"/>
+          <w:szCs w:val="24"/>
+        </w:rPr>
+      </w:pPr>
+      <w:r>
+        <w:rPr>
+          <w:b/>
+          <w:bCs/>
+          <w:sz w:val="24"/>
+          <w:szCs w:val="24"/>
+        </w:rPr>
+        <w:t xml:space="preserve">CODE: </w:t>
+      </w:r>
+    </w:p>
+    <w:p>
+      <w:r>
+        <w:t>import pickle</w:t>
+      </w:r>
+    </w:p>
+    <w:p>
+      <w:r>
+        <w:t xml:space="preserve">import </w:t>
+      </w:r>
+      <w:proofErr w:type="spellStart"/>
+      <w:r>
+        <w:t>numpy</w:t>
+      </w:r>
+      <w:proofErr w:type="spellEnd"/>
+      <w:r>
+        <w:t xml:space="preserve"> as np</w:t>
+      </w:r>
+    </w:p>
+    <w:p>
+      <w:r>
+        <w:t xml:space="preserve">import </w:t>
+      </w:r>
+      <w:proofErr w:type="spellStart"/>
+      <w:proofErr w:type="gramStart"/>
+      <w:r>
+        <w:t>matplotlib.pyplot</w:t>
+      </w:r>
+      <w:proofErr w:type="spellEnd"/>
+      <w:proofErr w:type="gramEnd"/>
+      <w:r>
+        <w:t xml:space="preserve"> as </w:t>
+      </w:r>
+      <w:proofErr w:type="spellStart"/>
+      <w:r>
+        <w:t>plt</w:t>
+      </w:r>
+      <w:proofErr w:type="spellEnd"/>
+    </w:p>
+    <w:p/>
+    <w:p>
+      <w:r>
+        <w:rPr>
+          <w:i/>
+          <w:iCs/>
+        </w:rPr>
+        <w:t>def</w:t>
+      </w:r>
+      <w:r>
+        <w:t xml:space="preserve"> unpickle(</w:t>
+      </w:r>
+      <w:r>
+        <w:rPr>
+          <w:i/>
+          <w:iCs/>
+        </w:rPr>
+        <w:t>file</w:t>
+      </w:r>
+      <w:r>
+        <w:t>):</w:t>
+      </w:r>
+    </w:p>
+    <w:p>
+      <w:r>
+        <w:t xml:space="preserve">    with </w:t>
+      </w:r>
+      <w:proofErr w:type="gramStart"/>
+      <w:r>
+        <w:rPr>
+          <w:b/>
+          <w:bCs/>
+        </w:rPr>
+        <w:t>open</w:t>
+      </w:r>
+      <w:r>
+        <w:t>(</w:t>
+      </w:r>
+      <w:proofErr w:type="gramEnd"/>
+      <w:r>
+        <w:t>file, '</w:t>
+      </w:r>
+      <w:proofErr w:type="spellStart"/>
+      <w:r>
+        <w:t>rb</w:t>
+      </w:r>
+      <w:proofErr w:type="spellEnd"/>
+      <w:r>
+        <w:t xml:space="preserve">') as </w:t>
+      </w:r>
+      <w:proofErr w:type="spellStart"/>
+      <w:r>
+        <w:t>fo</w:t>
+      </w:r>
+      <w:proofErr w:type="spellEnd"/>
+      <w:r>
+        <w:t>:</w:t>
+      </w:r>
+    </w:p>
+    <w:p>
+      <w:r>
+        <w:t xml:space="preserve">        data = </w:t>
+      </w:r>
+      <w:proofErr w:type="spellStart"/>
+      <w:proofErr w:type="gramStart"/>
+      <w:r>
+        <w:t>pickle.load</w:t>
+      </w:r>
+      <w:proofErr w:type="spellEnd"/>
+      <w:proofErr w:type="gramEnd"/>
+      <w:r>
+        <w:t>(</w:t>
+      </w:r>
+      <w:proofErr w:type="spellStart"/>
+      <w:r>
+        <w:t>fo</w:t>
+      </w:r>
+      <w:proofErr w:type="spellEnd"/>
+      <w:r>
+        <w:t xml:space="preserve">, </w:t>
+      </w:r>
+      <w:r>
+        <w:rPr>
+          <w:i/>
+          <w:iCs/>
+        </w:rPr>
+        <w:t>encoding</w:t>
+      </w:r>
+      <w:r>
+        <w:t>='bytes')</w:t>
+      </w:r>
+    </w:p>
+    <w:p>
+      <w:r>
+        <w:t>    return data</w:t>
+      </w:r>
+    </w:p>
+    <w:p/>
+    <w:p>
+      <w:r>
+        <w:t># 1. Load an Image</w:t>
+      </w:r>
+    </w:p>
+    <w:p>
+      <w:r>
+        <w:t>batch = unpickle(</w:t>
+      </w:r>
+      <w:r>
+        <w:rPr>
+          <w:i/>
+          <w:iCs/>
+        </w:rPr>
+        <w:t>r</w:t>
+      </w:r>
+      <w:r>
+        <w:t>"D:\SEM_5\ML\datasets\Image_data\cifar-10-batches-py\data_batch_1")</w:t>
+      </w:r>
+    </w:p>
+    <w:p>
+      <w:r>
+        <w:t>image = batch[</w:t>
+      </w:r>
+      <w:proofErr w:type="spellStart"/>
+      <w:r>
+        <w:rPr>
+          <w:i/>
+          <w:iCs/>
+        </w:rPr>
+        <w:t>b</w:t>
+      </w:r>
+      <w:r>
+        <w:t>'data</w:t>
+      </w:r>
+      <w:proofErr w:type="spellEnd"/>
+      <w:r>
+        <w:t>'][0]</w:t>
+      </w:r>
+    </w:p>
+    <w:p>
+      <w:r>
+        <w:t xml:space="preserve">image = </w:t>
+      </w:r>
+      <w:proofErr w:type="spellStart"/>
+      <w:proofErr w:type="gramStart"/>
+      <w:r>
+        <w:t>image.reshape</w:t>
+      </w:r>
+      <w:proofErr w:type="spellEnd"/>
+      <w:proofErr w:type="gramEnd"/>
+      <w:r>
+        <w:t>(3, 32, 32)</w:t>
+      </w:r>
+    </w:p>
+    <w:p>
+      <w:r>
+        <w:t xml:space="preserve">image = </w:t>
+      </w:r>
+      <w:proofErr w:type="spellStart"/>
+      <w:proofErr w:type="gramStart"/>
+      <w:r>
+        <w:t>np.transpose</w:t>
+      </w:r>
+      <w:proofErr w:type="spellEnd"/>
+      <w:proofErr w:type="gramEnd"/>
+      <w:r>
+        <w:t>(image, (1, 2, 0))</w:t>
+      </w:r>
+    </w:p>
+    <w:p/>
+    <w:p>
+      <w:r>
+        <w:t># 2. Display the Image</w:t>
+      </w:r>
+    </w:p>
+    <w:p>
+      <w:proofErr w:type="spellStart"/>
+      <w:proofErr w:type="gramStart"/>
+      <w:r>
+        <w:t>plt.imshow</w:t>
+      </w:r>
+      <w:proofErr w:type="spellEnd"/>
+      <w:proofErr w:type="gramEnd"/>
+      <w:r>
+        <w:t>(image)</w:t>
+      </w:r>
+    </w:p>
+    <w:p>
+      <w:proofErr w:type="spellStart"/>
+      <w:proofErr w:type="gramStart"/>
+      <w:r>
+        <w:t>plt.title</w:t>
+      </w:r>
+      <w:proofErr w:type="spellEnd"/>
+      <w:proofErr w:type="gramEnd"/>
+      <w:r>
+        <w:t>("CIFAR-10 Image")</w:t>
+      </w:r>
+    </w:p>
+    <w:p>
+      <w:proofErr w:type="spellStart"/>
+      <w:proofErr w:type="gramStart"/>
+      <w:r>
+        <w:t>plt.axis</w:t>
+      </w:r>
+      <w:proofErr w:type="spellEnd"/>
+      <w:proofErr w:type="gramEnd"/>
+      <w:r>
+        <w:t>('off')</w:t>
+      </w:r>
+    </w:p>
+    <w:p>
+      <w:proofErr w:type="spellStart"/>
+      <w:proofErr w:type="gramStart"/>
+      <w:r>
+        <w:t>plt.show</w:t>
+      </w:r>
+      <w:proofErr w:type="spellEnd"/>
+      <w:proofErr w:type="gramEnd"/>
+      <w:r>
+        <w:t>()</w:t>
+      </w:r>
+    </w:p>
+    <w:p/>
+    <w:p>
+      <w:r>
+        <w:t># 3. Determine Image Dimensions</w:t>
+      </w:r>
+    </w:p>
+    <w:p>
+      <w:r>
+        <w:t xml:space="preserve">height, width, channels = </w:t>
+      </w:r>
+      <w:proofErr w:type="spellStart"/>
+      <w:proofErr w:type="gramStart"/>
+      <w:r>
+        <w:t>image.shape</w:t>
+      </w:r>
+      <w:proofErr w:type="spellEnd"/>
+      <w:proofErr w:type="gramEnd"/>
+    </w:p>
+    <w:p>
+      <w:proofErr w:type="gramStart"/>
+      <w:r>
+        <w:rPr>
+          <w:b/>
+          <w:bCs/>
+        </w:rPr>
+        <w:t>print</w:t>
+      </w:r>
+      <w:r>
+        <w:t>(</w:t>
+      </w:r>
+      <w:proofErr w:type="gramEnd"/>
+      <w:r>
+        <w:t>"Image Dimensions:")</w:t>
+      </w:r>
+    </w:p>
+    <w:p>
+      <w:proofErr w:type="gramStart"/>
+      <w:r>
+        <w:rPr>
+          <w:b/>
+          <w:bCs/>
+        </w:rPr>
+        <w:t>print</w:t>
+      </w:r>
+      <w:r>
+        <w:t>(</w:t>
+      </w:r>
+      <w:proofErr w:type="gramEnd"/>
+      <w:r>
+        <w:t>"Height =", height)</w:t>
+      </w:r>
+    </w:p>
+    <w:p>
+      <w:proofErr w:type="gramStart"/>
+      <w:r>
+        <w:rPr>
+          <w:b/>
+          <w:bCs/>
+        </w:rPr>
+        <w:lastRenderedPageBreak/>
+        <w:t>print</w:t>
+      </w:r>
+      <w:r>
+        <w:t>(</w:t>
+      </w:r>
+      <w:proofErr w:type="gramEnd"/>
+      <w:r>
+        <w:t>"Width =", width)</w:t>
+      </w:r>
+    </w:p>
+    <w:p>
+      <w:proofErr w:type="gramStart"/>
+      <w:r>
+        <w:rPr>
+          <w:b/>
+          <w:bCs/>
+        </w:rPr>
+        <w:t>print</w:t>
+      </w:r>
+      <w:r>
+        <w:t>(</w:t>
+      </w:r>
+      <w:proofErr w:type="gramEnd"/>
+      <w:r>
+        <w:t>"Channels =", channels)</w:t>
+      </w:r>
+    </w:p>
+    <w:p/>
+    <w:p>
+      <w:r>
+        <w:t># 4. RGB or Grayscale</w:t>
+      </w:r>
+    </w:p>
+    <w:p>
+      <w:r>
+        <w:t>if channels == 3:</w:t>
+      </w:r>
+    </w:p>
+    <w:p>
+      <w:r>
+        <w:t xml:space="preserve">    </w:t>
+      </w:r>
+      <w:proofErr w:type="gramStart"/>
+      <w:r>
+        <w:rPr>
+          <w:b/>
+          <w:bCs/>
+        </w:rPr>
+        <w:t>print</w:t>
+      </w:r>
+      <w:r>
+        <w:t>(</w:t>
+      </w:r>
+      <w:proofErr w:type="gramEnd"/>
+      <w:r>
+        <w:t>"\</w:t>
+      </w:r>
+      <w:proofErr w:type="spellStart"/>
+      <w:r>
+        <w:t>nImage</w:t>
+      </w:r>
+      <w:proofErr w:type="spellEnd"/>
+      <w:r>
+        <w:t xml:space="preserve"> Type: RGB")</w:t>
+      </w:r>
+    </w:p>
+    <w:p>
+      <w:r>
+        <w:t xml:space="preserve">    </w:t>
+      </w:r>
+      <w:proofErr w:type="spellStart"/>
+      <w:r>
+        <w:t>gray</w:t>
+      </w:r>
+      <w:proofErr w:type="spellEnd"/>
+      <w:r>
+        <w:t xml:space="preserve"> = </w:t>
+      </w:r>
+      <w:proofErr w:type="spellStart"/>
+      <w:proofErr w:type="gramStart"/>
+      <w:r>
+        <w:t>np.mean</w:t>
+      </w:r>
+      <w:proofErr w:type="spellEnd"/>
+      <w:proofErr w:type="gramEnd"/>
+      <w:r>
+        <w:t xml:space="preserve">(image, </w:t>
+      </w:r>
+      <w:r>
+        <w:rPr>
+          <w:i/>
+          <w:iCs/>
+        </w:rPr>
+        <w:t>axis</w:t>
+      </w:r>
+      <w:r>
+        <w:t>=2)</w:t>
+      </w:r>
+    </w:p>
+    <w:p>
+      <w:r>
+        <w:t xml:space="preserve">    </w:t>
+      </w:r>
+      <w:proofErr w:type="spellStart"/>
+      <w:proofErr w:type="gramStart"/>
+      <w:r>
+        <w:t>plt.imshow</w:t>
+      </w:r>
+      <w:proofErr w:type="spellEnd"/>
+      <w:proofErr w:type="gramEnd"/>
+      <w:r>
+        <w:t>(</w:t>
+      </w:r>
+      <w:proofErr w:type="spellStart"/>
+      <w:r>
+        <w:t>gray</w:t>
+      </w:r>
+      <w:proofErr w:type="spellEnd"/>
+      <w:r>
+        <w:t xml:space="preserve">, </w:t>
+      </w:r>
+      <w:proofErr w:type="spellStart"/>
+      <w:r>
+        <w:rPr>
+          <w:i/>
+          <w:iCs/>
+        </w:rPr>
+        <w:t>cmap</w:t>
+      </w:r>
+      <w:proofErr w:type="spellEnd"/>
+      <w:r>
+        <w:t>='</w:t>
+      </w:r>
+      <w:proofErr w:type="spellStart"/>
+      <w:r>
+        <w:t>gray</w:t>
+      </w:r>
+      <w:proofErr w:type="spellEnd"/>
+      <w:r>
+        <w:t>')</w:t>
+      </w:r>
+    </w:p>
+    <w:p>
+      <w:r>
+        <w:t xml:space="preserve">    </w:t>
+      </w:r>
+      <w:proofErr w:type="spellStart"/>
+      <w:proofErr w:type="gramStart"/>
+      <w:r>
+        <w:t>plt.title</w:t>
+      </w:r>
+      <w:proofErr w:type="spellEnd"/>
+      <w:proofErr w:type="gramEnd"/>
+      <w:r>
+        <w:t>("Grayscale Image")</w:t>
+      </w:r>
+    </w:p>
+    <w:p>
+      <w:r>
+        <w:t xml:space="preserve">    </w:t>
+      </w:r>
+      <w:proofErr w:type="spellStart"/>
+      <w:proofErr w:type="gramStart"/>
+      <w:r>
+        <w:t>plt.axis</w:t>
+      </w:r>
+      <w:proofErr w:type="spellEnd"/>
+      <w:proofErr w:type="gramEnd"/>
+      <w:r>
+        <w:t>('off')</w:t>
+      </w:r>
+    </w:p>
+    <w:p>
+      <w:r>
+        <w:t xml:space="preserve">    </w:t>
+      </w:r>
+      <w:proofErr w:type="spellStart"/>
+      <w:proofErr w:type="gramStart"/>
+      <w:r>
+        <w:t>plt.show</w:t>
+      </w:r>
+      <w:proofErr w:type="spellEnd"/>
+      <w:proofErr w:type="gramEnd"/>
+      <w:r>
+        <w:t>()</w:t>
+      </w:r>
+    </w:p>
+    <w:p>
+      <w:r>
+        <w:t>else:</w:t>
+      </w:r>
+    </w:p>
+    <w:p>
+      <w:r>
+        <w:t xml:space="preserve">    </w:t>
+      </w:r>
+      <w:proofErr w:type="gramStart"/>
+      <w:r>
+        <w:rPr>
+          <w:b/>
+          <w:bCs/>
+        </w:rPr>
+        <w:t>print</w:t>
+      </w:r>
+      <w:r>
+        <w:t>(</w:t>
+      </w:r>
+      <w:proofErr w:type="gramEnd"/>
+      <w:r>
+        <w:t>"\</w:t>
+      </w:r>
+      <w:proofErr w:type="spellStart"/>
+      <w:r>
+        <w:t>nImage</w:t>
+      </w:r>
+      <w:proofErr w:type="spellEnd"/>
+      <w:r>
+        <w:t xml:space="preserve"> Type: Grayscale")</w:t>
+      </w:r>
+    </w:p>
+    <w:p/>
+    <w:p>
+      <w:r>
+        <w:t># 5. Total Number of Pixels</w:t>
+      </w:r>
+    </w:p>
+    <w:p>
+      <w:r>
+        <w:t>pixels = height * width</w:t>
+      </w:r>
+    </w:p>
+    <w:p>
+      <w:proofErr w:type="gramStart"/>
+      <w:r>
+        <w:rPr>
+          <w:b/>
+          <w:bCs/>
+        </w:rPr>
+        <w:t>print</w:t>
+      </w:r>
+      <w:r>
+        <w:t>(</w:t>
+      </w:r>
+      <w:proofErr w:type="gramEnd"/>
+      <w:r>
+        <w:t>"\</w:t>
+      </w:r>
+      <w:proofErr w:type="spellStart"/>
+      <w:r>
+        <w:t>nTotal</w:t>
+      </w:r>
+      <w:proofErr w:type="spellEnd"/>
+      <w:r>
+        <w:t xml:space="preserve"> Number of Pixels =", pixels)</w:t>
+      </w:r>
+    </w:p>
+    <w:p/>
+    <w:p>
+      <w:pPr>
+        <w:rPr>
+          <w:b/>
+          <w:bCs/>
+          <w:sz w:val="24"/>
+          <w:szCs w:val="24"/>
+        </w:rPr>
+      </w:pPr>
+      <w:r>
+        <w:rPr>
+          <w:b/>
+          <w:bCs/>
+          <w:sz w:val="24"/>
+          <w:szCs w:val="24"/>
+        </w:rPr>
+        <w:t>OUTPUT:</w:t>
+      </w:r>
+    </w:p>
+    <w:p>
+      <w:pPr>
+        <w:rPr>
+          <w:b/>
+          <w:bCs/>
+          <w:sz w:val="24"/>
+          <w:szCs w:val="24"/>
+        </w:rPr>
+      </w:pPr>
+      <w:r>
+        <w:rPr>
+          <w:b/>
+          <w:bCs/>
+          <w:sz w:val="24"/>
+          <w:szCs w:val="24"/>
+        </w:rPr>
+        <w:t>1.</w:t>
+      </w:r>
+    </w:p>
+    <w:p>
+      <w:r>
+        <w:drawing>
+          <wp:inline distT="0" distB="0" distL="0" distR="0" wp14:anchorId="16A7FBD7" wp14:editId="17A03C14">
+            <wp:extent cx="4689695" cy="4003755"/>
+            <wp:effectExtent l="0" t="0" r="0" b="0"/>
+            <wp:docPr id="1958288707" name="Picture 1"/>
+            <wp:cNvGraphicFramePr>
+              <a:graphicFrameLocks xmlns:a="http://schemas.openxmlformats.org/drawingml/2006/main" noChangeAspect="1"/>
+            </wp:cNvGraphicFramePr>
+            <a:graphic xmlns:a="http://schemas.openxmlformats.org/drawingml/2006/main">
+              <a:graphicData uri="http://schemas.openxmlformats.org/drawingml/2006/picture">
+                <pic:pic xmlns:pic="http://schemas.openxmlformats.org/drawingml/2006/picture">
+                  <pic:nvPicPr>
+                    <pic:cNvPr id="1958288707" name=""/>
+                    <pic:cNvPicPr/>
+                  </pic:nvPicPr>
+                  <pic:blipFill>
+                    <a:blip r:embed="rId22"/>
+                    <a:stretch>
+                      <a:fillRect/>
+                    </a:stretch>
+                  </pic:blipFill>
+                  <pic:spPr>
+                    <a:xfrm>
+                      <a:off x="0" y="0"/>
+                      <a:ext cx="4707180" cy="4018682"/>
+                    </a:xfrm>
+                    <a:prstGeom prst="rect">
+                      <a:avLst/>
+                    </a:prstGeom>
+                  </pic:spPr>
+                </pic:pic>
+              </a:graphicData>
+            </a:graphic>
+          </wp:inline>
+        </w:drawing>
+      </w:r>
+    </w:p>
+    <w:p>
+      <w:r>
+        <w:lastRenderedPageBreak/>
+        <w:t xml:space="preserve">2. </w:t>
+      </w:r>
+    </w:p>
+    <w:p>
+      <w:r>
+        <w:drawing>
+          <wp:inline distT="0" distB="0" distL="0" distR="0" wp14:anchorId="0F12840C" wp14:editId="1FFB29D2">
+            <wp:extent cx="5332491" cy="4552531"/>
+            <wp:effectExtent l="0" t="0" r="1905" b="635"/>
+            <wp:docPr id="1449390064" name="Picture 1"/>
+            <wp:cNvGraphicFramePr>
+              <a:graphicFrameLocks xmlns:a="http://schemas.openxmlformats.org/drawingml/2006/main" noChangeAspect="1"/>
+            </wp:cNvGraphicFramePr>
+            <a:graphic xmlns:a="http://schemas.openxmlformats.org/drawingml/2006/main">
+              <a:graphicData uri="http://schemas.openxmlformats.org/drawingml/2006/picture">
+                <pic:pic xmlns:pic="http://schemas.openxmlformats.org/drawingml/2006/picture">
+                  <pic:nvPicPr>
+                    <pic:cNvPr id="1449390064" name=""/>
+                    <pic:cNvPicPr/>
+                  </pic:nvPicPr>
+                  <pic:blipFill>
+                    <a:blip r:embed="rId23"/>
+                    <a:stretch>
+                      <a:fillRect/>
+                    </a:stretch>
+                  </pic:blipFill>
+                  <pic:spPr>
+                    <a:xfrm>
+                      <a:off x="0" y="0"/>
+                      <a:ext cx="5339315" cy="4558356"/>
+                    </a:xfrm>
+                    <a:prstGeom prst="rect">
+                      <a:avLst/>
+                    </a:prstGeom>
+                  </pic:spPr>
+                </pic:pic>
+              </a:graphicData>
+            </a:graphic>
+          </wp:inline>
+        </w:drawing>
+      </w:r>
+    </w:p>
+    <w:p/>
+    <w:p>
+      <w:r>
+        <w:t xml:space="preserve">3. </w:t>
+      </w:r>
+    </w:p>
+    <w:p>
+      <w:pPr>
+        <w:rPr>
+          <w:noProof/>
+        </w:rPr>
+      </w:pPr>
+      <w:r>
+        <w:drawing>
+          <wp:inline distT="0" distB="0" distL="0" distR="0" wp14:anchorId="710BBBD5" wp14:editId="6A31CFB7">
+            <wp:extent cx="1562180" cy="711237"/>
+            <wp:effectExtent l="0" t="0" r="0" b="0"/>
+            <wp:docPr id="18983734" name="Picture 1"/>
+            <wp:cNvGraphicFramePr>
+              <a:graphicFrameLocks xmlns:a="http://schemas.openxmlformats.org/drawingml/2006/main" noChangeAspect="1"/>
+            </wp:cNvGraphicFramePr>
+            <a:graphic xmlns:a="http://schemas.openxmlformats.org/drawingml/2006/main">
+              <a:graphicData uri="http://schemas.openxmlformats.org/drawingml/2006/picture">
+                <pic:pic xmlns:pic="http://schemas.openxmlformats.org/drawingml/2006/picture">
+                  <pic:nvPicPr>
+                    <pic:cNvPr id="18983734" name=""/>
+                    <pic:cNvPicPr/>
+                  </pic:nvPicPr>
+                  <pic:blipFill>
+                    <a:blip r:embed="rId24"/>
+                    <a:stretch>
+                      <a:fillRect/>
+                    </a:stretch>
+                  </pic:blipFill>
+                  <pic:spPr>
+                    <a:xfrm>
+                      <a:off x="0" y="0"/>
+                      <a:ext cx="1562180" cy="711237"/>
+                    </a:xfrm>
+                    <a:prstGeom prst="rect">
+                      <a:avLst/>
+                    </a:prstGeom>
+                  </pic:spPr>
+                </pic:pic>
+              </a:graphicData>
+            </a:graphic>
+          </wp:inline>
+        </w:drawing>
+      </w:r>
+    </w:p>
+    <w:p>
+      <w:pPr>
+        <w:rPr>
+          <w:noProof/>
+        </w:rPr>
+      </w:pPr>
+    </w:p>
+    <w:p>
+      <w:pPr>
+        <w:rPr>
+          <w:noProof/>
+        </w:rPr>
+      </w:pPr>
+      <w:r>
+        <w:rPr>
+          <w:noProof/>
+        </w:rPr>
+        <w:t>4.</w:t>
+      </w:r>
+      <w:r>
+        <w:rPr>
+          <w:noProof/>
+        </w:rPr>
+        <w:t xml:space="preserve"> </w:t>
+      </w:r>
+    </w:p>
+    <w:p>
+      <w:pPr>
+        <w:rPr>
+          <w:noProof/>
+        </w:rPr>
+      </w:pPr>
+      <w:r>
+        <w:drawing>
+          <wp:inline distT="0" distB="0" distL="0" distR="0" wp14:anchorId="1A21254C" wp14:editId="04A08218">
+            <wp:extent cx="1301817" cy="196860"/>
+            <wp:effectExtent l="0" t="0" r="0" b="0"/>
+            <wp:docPr id="1105152801" name="Picture 1"/>
+            <wp:cNvGraphicFramePr>
+              <a:graphicFrameLocks xmlns:a="http://schemas.openxmlformats.org/drawingml/2006/main" noChangeAspect="1"/>
+            </wp:cNvGraphicFramePr>
+            <a:graphic xmlns:a="http://schemas.openxmlformats.org/drawingml/2006/main">
+              <a:graphicData uri="http://schemas.openxmlformats.org/drawingml/2006/picture">
+                <pic:pic xmlns:pic="http://schemas.openxmlformats.org/drawingml/2006/picture">
+                  <pic:nvPicPr>
+                    <pic:cNvPr id="1105152801" name=""/>
+                    <pic:cNvPicPr/>
+                  </pic:nvPicPr>
+                  <pic:blipFill>
+                    <a:blip r:embed="rId25"/>
+                    <a:stretch>
+                      <a:fillRect/>
+                    </a:stretch>
+                  </pic:blipFill>
+                  <pic:spPr>
+                    <a:xfrm>
+                      <a:off x="0" y="0"/>
+                      <a:ext cx="1301817" cy="196860"/>
+                    </a:xfrm>
+                    <a:prstGeom prst="rect">
+                      <a:avLst/>
+                    </a:prstGeom>
+                  </pic:spPr>
+                </pic:pic>
+              </a:graphicData>
+            </a:graphic>
+          </wp:inline>
+        </w:drawing>
+      </w:r>
+    </w:p>
+    <w:p>
+      <w:pPr>
+        <w:rPr>
+          <w:noProof/>
+        </w:rPr>
+      </w:pPr>
+    </w:p>
+    <w:p>
+      <w:pPr>
+        <w:rPr>
+          <w:noProof/>
+        </w:rPr>
+      </w:pPr>
+      <w:r>
+        <w:rPr>
+          <w:noProof/>
+        </w:rPr>
+        <w:t>5.</w:t>
+      </w:r>
+    </w:p>
+    <w:p>
+      <w:r>
+        <w:rPr>
+          <w:noProof/>
+        </w:rPr>
+        <w:t xml:space="preserve"> </w:t>
+      </w:r>
+      <w:r>
+        <w:rPr>
+          <w:noProof/>
+        </w:rPr>
+        <w:drawing>
+          <wp:inline distT="0" distB="0" distL="0" distR="0" wp14:anchorId="335D01AF" wp14:editId="12165B10">
+            <wp:extent cx="2133710" cy="196860"/>
+            <wp:effectExtent l="0" t="0" r="0" b="0"/>
+            <wp:docPr id="1671081495" name="Picture 1"/>
+            <wp:cNvGraphicFramePr>
+              <a:graphicFrameLocks xmlns:a="http://schemas.openxmlformats.org/drawingml/2006/main" noChangeAspect="1"/>
+            </wp:cNvGraphicFramePr>
+            <a:graphic xmlns:a="http://schemas.openxmlformats.org/drawingml/2006/main">
+              <a:graphicData uri="http://schemas.openxmlformats.org/drawingml/2006/picture">
+                <pic:pic xmlns:pic="http://schemas.openxmlformats.org/drawingml/2006/picture">
+                  <pic:nvPicPr>
+                    <pic:cNvPr id="1671081495" name=""/>
+                    <pic:cNvPicPr/>
+                  </pic:nvPicPr>
+                  <pic:blipFill>
+                    <a:blip r:embed="rId26"/>
+                    <a:stretch>
+                      <a:fillRect/>
+                    </a:stretch>
+                  </pic:blipFill>
+                  <pic:spPr>
+                    <a:xfrm>
+                      <a:off x="0" y="0"/>
+                      <a:ext cx="2133710" cy="196860"/>
+                    </a:xfrm>
+                    <a:prstGeom prst="rect">
+                      <a:avLst/>
+                    </a:prstGeom>
+                  </pic:spPr>
+                </pic:pic>
+              </a:graphicData>
+            </a:graphic>
+          </wp:inline>
+        </w:drawing>
+      </w:r>
+    </w:p>
     <w:sectPr>
       <w:pgSz w:w="11906" w:h="16838"/>
       <w:pgMar w:top="720" w:right="720" w:bottom="720" w:left="720" w:header="708" w:footer="708" w:gutter="0"/>
+      <w:pgBorders w:offsetFrom="page">
+        <w:top w:val="single" w:sz="4" w:space="24" w:color="auto"/>
+        <w:left w:val="single" w:sz="4" w:space="24" w:color="auto"/>
+        <w:bottom w:val="single" w:sz="4" w:space="24" w:color="auto"/>
+        <w:right w:val="single" w:sz="4" w:space="24" w:color="auto"/>
+      </w:pgBorders>
       <w:cols w:space="708"/>
       <w:docGrid w:linePitch="360"/>
     </w:sectPr>
@@ -847,6 +4935,7 @@
   <w:style w:type="paragraph" w:default="1" w:styleId="Normal">
     <w:name w:val="Normal"/>
     <w:qFormat/>
+    <w:rsid w:val="00847685"/>
   </w:style>
   <w:style w:type="paragraph" w:styleId="Heading1">
     <w:name w:val="heading 1"/>
@@ -1050,7 +5139,6 @@
   <w:style w:type="character" w:default="1" w:styleId="DefaultParagraphFont">
     <w:name w:val="Default Paragraph Font"/>
     <w:uiPriority w:val="1"/>
-    <w:semiHidden/>
     <w:unhideWhenUsed/>
   </w:style>
   <w:style w:type="table" w:default="1" w:styleId="TableNormal">
@@ -1364,6 +5452,25 @@
       <w:spacing w:val="5"/>
     </w:rPr>
   </w:style>
+  <w:style w:type="table" w:styleId="TableGrid">
+    <w:name w:val="Table Grid"/>
+    <w:basedOn w:val="TableNormal"/>
+    <w:uiPriority w:val="39"/>
+    <w:rsid w:val="00EE2063"/>
+    <w:pPr>
+      <w:spacing w:after="0" w:line="240" w:lineRule="auto"/>
+    </w:pPr>
+    <w:tblPr>
+      <w:tblBorders>
+        <w:top w:val="single" w:sz="4" w:space="0" w:color="auto"/>
+        <w:left w:val="single" w:sz="4" w:space="0" w:color="auto"/>
+        <w:bottom w:val="single" w:sz="4" w:space="0" w:color="auto"/>
+        <w:right w:val="single" w:sz="4" w:space="0" w:color="auto"/>
+        <w:insideH w:val="single" w:sz="4" w:space="0" w:color="auto"/>
+        <w:insideV w:val="single" w:sz="4" w:space="0" w:color="auto"/>
+      </w:tblBorders>
+    </w:tblPr>
+  </w:style>
 </w:styles>
 </file>
 

</xml_diff>